<commit_message>
Dodal prvotno RAIN poročilo
</commit_message>
<xml_diff>
--- a/Osnove.docx
+++ b/Osnove.docx
@@ -510,25 +510,7 @@
           <w:sz w:val="28"/>
           <w:szCs w:val="28"/>
         </w:rPr>
-        <w:t xml:space="preserve"> (</w:t>
-      </w:r>
-      <w:proofErr w:type="spellStart"/>
-      <w:r>
-        <w:rPr>
-          <w:rFonts w:ascii="Arial" w:hAnsi="Arial" w:cs="Arial"/>
-          <w:sz w:val="28"/>
-          <w:szCs w:val="28"/>
-        </w:rPr>
-        <w:t>score</w:t>
-      </w:r>
-      <w:proofErr w:type="spellEnd"/>
-      <w:r>
-        <w:rPr>
-          <w:rFonts w:ascii="Arial" w:hAnsi="Arial" w:cs="Arial"/>
-          <w:sz w:val="28"/>
-          <w:szCs w:val="28"/>
-        </w:rPr>
-        <w:t>)</w:t>
+        <w:t xml:space="preserve"> (score)</w:t>
       </w:r>
     </w:p>
     <w:p>
@@ -673,43 +655,7 @@
           <w:sz w:val="28"/>
           <w:szCs w:val="28"/>
         </w:rPr>
-        <w:t>, drugače samo '</w:t>
-      </w:r>
-      <w:proofErr w:type="spellStart"/>
-      <w:r>
-        <w:rPr>
-          <w:rFonts w:ascii="Arial" w:hAnsi="Arial" w:cs="Arial"/>
-          <w:sz w:val="28"/>
-          <w:szCs w:val="28"/>
-        </w:rPr>
-        <w:t>intro</w:t>
-      </w:r>
-      <w:proofErr w:type="spellEnd"/>
-      <w:r>
-        <w:rPr>
-          <w:rFonts w:ascii="Arial" w:hAnsi="Arial" w:cs="Arial"/>
-          <w:sz w:val="28"/>
-          <w:szCs w:val="28"/>
-        </w:rPr>
-        <w:t xml:space="preserve"> </w:t>
-      </w:r>
-      <w:proofErr w:type="spellStart"/>
-      <w:r>
-        <w:rPr>
-          <w:rFonts w:ascii="Arial" w:hAnsi="Arial" w:cs="Arial"/>
-          <w:sz w:val="28"/>
-          <w:szCs w:val="28"/>
-        </w:rPr>
-        <w:t>page</w:t>
-      </w:r>
-      <w:proofErr w:type="spellEnd"/>
-      <w:r>
-        <w:rPr>
-          <w:rFonts w:ascii="Arial" w:hAnsi="Arial" w:cs="Arial"/>
-          <w:sz w:val="28"/>
-          <w:szCs w:val="28"/>
-        </w:rPr>
-        <w:t>'</w:t>
+        <w:t>, drugače samo 'intro page'</w:t>
       </w:r>
     </w:p>
     <w:p>
@@ -1072,18 +1018,32 @@
           <w:sz w:val="28"/>
           <w:szCs w:val="28"/>
         </w:rPr>
+        <w:t xml:space="preserve"> pedometer</w:t>
+      </w:r>
+      <w:r>
+        <w:rPr>
+          <w:rFonts w:ascii="Arial" w:hAnsi="Arial" w:cs="Arial"/>
+          <w:sz w:val="28"/>
+          <w:szCs w:val="28"/>
+        </w:rPr>
         <w:t xml:space="preserve"> </w:t>
       </w:r>
-      <w:proofErr w:type="spellStart"/>
-      <w:r>
-        <w:rPr>
-          <w:rFonts w:ascii="Arial" w:hAnsi="Arial" w:cs="Arial"/>
-          <w:sz w:val="28"/>
-          <w:szCs w:val="28"/>
-        </w:rPr>
-        <w:t>pedometer</w:t>
-      </w:r>
-      <w:proofErr w:type="spellEnd"/>
+      <w:r>
+        <w:rPr>
+          <w:rFonts w:ascii="Arial" w:hAnsi="Arial" w:cs="Arial"/>
+          <w:sz w:val="28"/>
+          <w:szCs w:val="28"/>
+        </w:rPr>
+        <w:t>–</w:t>
+      </w:r>
+      <w:r>
+        <w:rPr>
+          <w:rFonts w:ascii="Arial" w:hAnsi="Arial" w:cs="Arial"/>
+          <w:sz w:val="28"/>
+          <w:szCs w:val="28"/>
+        </w:rPr>
+        <w:t xml:space="preserve"> VNAŠANJE</w:t>
+      </w:r>
       <w:r>
         <w:rPr>
           <w:rFonts w:ascii="Arial" w:hAnsi="Arial" w:cs="Arial"/>
@@ -1098,6 +1058,60 @@
           <w:sz w:val="28"/>
           <w:szCs w:val="28"/>
         </w:rPr>
+        <w:t xml:space="preserve">AVG </w:t>
+      </w:r>
+      <w:r>
+        <w:rPr>
+          <w:rFonts w:ascii="Arial" w:hAnsi="Arial" w:cs="Arial"/>
+          <w:sz w:val="28"/>
+          <w:szCs w:val="28"/>
+        </w:rPr>
+        <w:t>in MERJENJE</w:t>
+      </w:r>
+    </w:p>
+    <w:p>
+      <w:pPr>
+        <w:pStyle w:val="Odstavekseznama"/>
+        <w:numPr>
+          <w:ilvl w:val="0"/>
+          <w:numId w:val="1"/>
+        </w:numPr>
+        <w:rPr>
+          <w:rFonts w:ascii="Arial" w:hAnsi="Arial" w:cs="Arial"/>
+          <w:sz w:val="28"/>
+          <w:szCs w:val="28"/>
+        </w:rPr>
+      </w:pPr>
+      <w:r>
+        <w:rPr>
+          <w:rFonts w:ascii="Arial" w:hAnsi="Arial" w:cs="Arial"/>
+          <w:sz w:val="28"/>
+          <w:szCs w:val="28"/>
+        </w:rPr>
+        <w:t>Social</w:t>
+      </w:r>
+      <w:r>
+        <w:rPr>
+          <w:rFonts w:ascii="Arial" w:hAnsi="Arial" w:cs="Arial"/>
+          <w:sz w:val="28"/>
+          <w:szCs w:val="28"/>
+        </w:rPr>
+        <w:t>izacija</w:t>
+      </w:r>
+      <w:r>
+        <w:rPr>
+          <w:rFonts w:ascii="Arial" w:hAnsi="Arial" w:cs="Arial"/>
+          <w:sz w:val="28"/>
+          <w:szCs w:val="28"/>
+        </w:rPr>
+        <w:t xml:space="preserve"> </w:t>
+      </w:r>
+      <w:r>
+        <w:rPr>
+          <w:rFonts w:ascii="Arial" w:hAnsi="Arial" w:cs="Arial"/>
+          <w:sz w:val="28"/>
+          <w:szCs w:val="28"/>
+        </w:rPr>
         <w:t>–</w:t>
       </w:r>
       <w:r>
@@ -1114,6 +1128,68 @@
           <w:sz w:val="28"/>
           <w:szCs w:val="28"/>
         </w:rPr>
+        <w:t xml:space="preserve"> (</w:t>
+      </w:r>
+      <w:r>
+        <w:rPr>
+          <w:rFonts w:ascii="Arial" w:hAnsi="Arial" w:cs="Arial"/>
+          <w:sz w:val="28"/>
+          <w:szCs w:val="28"/>
+        </w:rPr>
+        <w:t>Loneliness</w:t>
+      </w:r>
+      <w:r>
+        <w:rPr>
+          <w:rFonts w:ascii="Arial" w:hAnsi="Arial" w:cs="Arial"/>
+          <w:sz w:val="28"/>
+          <w:szCs w:val="28"/>
+        </w:rPr>
+        <w:t>/Social</w:t>
+      </w:r>
+      <w:r>
+        <w:rPr>
+          <w:rFonts w:ascii="Arial" w:hAnsi="Arial" w:cs="Arial"/>
+          <w:sz w:val="28"/>
+          <w:szCs w:val="28"/>
+        </w:rPr>
+        <w:t>_Score</w:t>
+      </w:r>
+      <w:r>
+        <w:rPr>
+          <w:rFonts w:ascii="Arial" w:hAnsi="Arial" w:cs="Arial"/>
+          <w:sz w:val="28"/>
+          <w:szCs w:val="28"/>
+        </w:rPr>
+        <w:t>)</w:t>
+      </w:r>
+    </w:p>
+    <w:p>
+      <w:pPr>
+        <w:pStyle w:val="Odstavekseznama"/>
+        <w:numPr>
+          <w:ilvl w:val="0"/>
+          <w:numId w:val="1"/>
+        </w:numPr>
+        <w:rPr>
+          <w:rFonts w:ascii="Arial" w:hAnsi="Arial" w:cs="Arial"/>
+          <w:sz w:val="28"/>
+          <w:szCs w:val="28"/>
+        </w:rPr>
+      </w:pPr>
+      <w:r>
+        <w:rPr>
+          <w:rFonts w:ascii="Arial" w:hAnsi="Arial" w:cs="Arial"/>
+          <w:sz w:val="28"/>
+          <w:szCs w:val="28"/>
+        </w:rPr>
+        <w:t>'Screentime' (ure)</w:t>
+      </w:r>
+      <w:r>
+        <w:rPr>
+          <w:rFonts w:ascii="Arial" w:hAnsi="Arial" w:cs="Arial"/>
+          <w:sz w:val="28"/>
+          <w:szCs w:val="28"/>
+        </w:rPr>
         <w:t xml:space="preserve"> </w:t>
       </w:r>
       <w:r>
@@ -1122,15 +1198,15 @@
           <w:sz w:val="28"/>
           <w:szCs w:val="28"/>
         </w:rPr>
-        <w:t xml:space="preserve">AVG </w:t>
-      </w:r>
-      <w:r>
-        <w:rPr>
-          <w:rFonts w:ascii="Arial" w:hAnsi="Arial" w:cs="Arial"/>
-          <w:sz w:val="28"/>
-          <w:szCs w:val="28"/>
-        </w:rPr>
-        <w:t>in MERJENJE</w:t>
+        <w:t xml:space="preserve">- </w:t>
+      </w:r>
+      <w:r>
+        <w:rPr>
+          <w:rFonts w:ascii="Arial" w:hAnsi="Arial" w:cs="Arial"/>
+          <w:sz w:val="28"/>
+          <w:szCs w:val="28"/>
+        </w:rPr>
+        <w:t>VNAŠANJE AVG in MERJENJE</w:t>
       </w:r>
     </w:p>
     <w:p>
@@ -1152,91 +1228,31 @@
           <w:sz w:val="28"/>
           <w:szCs w:val="28"/>
         </w:rPr>
-        <w:t>Social</w:t>
-      </w:r>
-      <w:r>
-        <w:rPr>
-          <w:rFonts w:ascii="Arial" w:hAnsi="Arial" w:cs="Arial"/>
-          <w:sz w:val="28"/>
-          <w:szCs w:val="28"/>
-        </w:rPr>
-        <w:t>izacija</w:t>
-      </w:r>
-      <w:r>
-        <w:rPr>
-          <w:rFonts w:ascii="Arial" w:hAnsi="Arial" w:cs="Arial"/>
-          <w:sz w:val="28"/>
-          <w:szCs w:val="28"/>
-        </w:rPr>
-        <w:t xml:space="preserve"> </w:t>
-      </w:r>
-      <w:r>
-        <w:rPr>
-          <w:rFonts w:ascii="Arial" w:hAnsi="Arial" w:cs="Arial"/>
-          <w:sz w:val="28"/>
-          <w:szCs w:val="28"/>
-        </w:rPr>
-        <w:t>–</w:t>
-      </w:r>
-      <w:r>
-        <w:rPr>
-          <w:rFonts w:ascii="Arial" w:hAnsi="Arial" w:cs="Arial"/>
-          <w:sz w:val="28"/>
-          <w:szCs w:val="28"/>
-        </w:rPr>
-        <w:t xml:space="preserve"> VNAŠANJE</w:t>
-      </w:r>
-      <w:r>
-        <w:rPr>
-          <w:rFonts w:ascii="Arial" w:hAnsi="Arial" w:cs="Arial"/>
-          <w:sz w:val="28"/>
-          <w:szCs w:val="28"/>
-        </w:rPr>
-        <w:t xml:space="preserve"> (</w:t>
-      </w:r>
-      <w:proofErr w:type="spellStart"/>
-      <w:r>
-        <w:rPr>
-          <w:rFonts w:ascii="Arial" w:hAnsi="Arial" w:cs="Arial"/>
-          <w:sz w:val="28"/>
-          <w:szCs w:val="28"/>
-        </w:rPr>
-        <w:t>Loneliness</w:t>
-      </w:r>
-      <w:proofErr w:type="spellEnd"/>
-      <w:r>
-        <w:rPr>
-          <w:rFonts w:ascii="Arial" w:hAnsi="Arial" w:cs="Arial"/>
-          <w:sz w:val="28"/>
-          <w:szCs w:val="28"/>
-        </w:rPr>
-        <w:t>/</w:t>
-      </w:r>
-      <w:proofErr w:type="spellStart"/>
-      <w:r>
-        <w:rPr>
-          <w:rFonts w:ascii="Arial" w:hAnsi="Arial" w:cs="Arial"/>
-          <w:sz w:val="28"/>
-          <w:szCs w:val="28"/>
-        </w:rPr>
-        <w:t>Social</w:t>
-      </w:r>
-      <w:r>
-        <w:rPr>
-          <w:rFonts w:ascii="Arial" w:hAnsi="Arial" w:cs="Arial"/>
-          <w:sz w:val="28"/>
-          <w:szCs w:val="28"/>
-        </w:rPr>
-        <w:t>_Score</w:t>
-      </w:r>
-      <w:proofErr w:type="spellEnd"/>
-      <w:r>
-        <w:rPr>
-          <w:rFonts w:ascii="Arial" w:hAnsi="Arial" w:cs="Arial"/>
-          <w:sz w:val="28"/>
-          <w:szCs w:val="28"/>
-        </w:rPr>
-        <w:t>)</w:t>
+        <w:t>Financia</w:t>
+      </w:r>
+      <w:r>
+        <w:rPr>
+          <w:rFonts w:ascii="Arial" w:hAnsi="Arial" w:cs="Arial"/>
+          <w:sz w:val="28"/>
+          <w:szCs w:val="28"/>
+        </w:rPr>
+        <w:t xml:space="preserve">l and </w:t>
+      </w:r>
+      <w:r>
+        <w:rPr>
+          <w:rFonts w:ascii="Arial" w:hAnsi="Arial" w:cs="Arial"/>
+          <w:sz w:val="28"/>
+          <w:szCs w:val="28"/>
+        </w:rPr>
+        <w:t>Work/School_Stress</w:t>
+      </w:r>
+      <w:r>
+        <w:rPr>
+          <w:rFonts w:ascii="Arial" w:hAnsi="Arial" w:cs="Arial"/>
+          <w:sz w:val="28"/>
+          <w:szCs w:val="28"/>
+        </w:rPr>
+        <w:t xml:space="preserve"> - VNAŠANJE</w:t>
       </w:r>
     </w:p>
     <w:p>
@@ -1258,49 +1274,15 @@
           <w:sz w:val="28"/>
           <w:szCs w:val="28"/>
         </w:rPr>
-        <w:t>'</w:t>
-      </w:r>
-      <w:proofErr w:type="spellStart"/>
-      <w:r>
-        <w:rPr>
-          <w:rFonts w:ascii="Arial" w:hAnsi="Arial" w:cs="Arial"/>
-          <w:sz w:val="28"/>
-          <w:szCs w:val="28"/>
-        </w:rPr>
-        <w:t>Screentime</w:t>
-      </w:r>
-      <w:proofErr w:type="spellEnd"/>
-      <w:r>
-        <w:rPr>
-          <w:rFonts w:ascii="Arial" w:hAnsi="Arial" w:cs="Arial"/>
-          <w:sz w:val="28"/>
-          <w:szCs w:val="28"/>
-        </w:rPr>
-        <w:t>' (ure)</w:t>
-      </w:r>
-      <w:r>
-        <w:rPr>
-          <w:rFonts w:ascii="Arial" w:hAnsi="Arial" w:cs="Arial"/>
-          <w:sz w:val="28"/>
-          <w:szCs w:val="28"/>
-        </w:rPr>
-        <w:t xml:space="preserve"> </w:t>
-      </w:r>
-      <w:r>
-        <w:rPr>
-          <w:rFonts w:ascii="Arial" w:hAnsi="Arial" w:cs="Arial"/>
-          <w:sz w:val="28"/>
-          <w:szCs w:val="28"/>
-        </w:rPr>
-        <w:t xml:space="preserve">- </w:t>
-      </w:r>
-      <w:r>
-        <w:rPr>
-          <w:rFonts w:ascii="Arial" w:hAnsi="Arial" w:cs="Arial"/>
-          <w:sz w:val="28"/>
-          <w:szCs w:val="28"/>
-        </w:rPr>
-        <w:t>VNAŠANJE AVG in MERJENJE</w:t>
+        <w:t>Self_Esteem_Score</w:t>
+      </w:r>
+      <w:r>
+        <w:rPr>
+          <w:rFonts w:ascii="Arial" w:hAnsi="Arial" w:cs="Arial"/>
+          <w:sz w:val="28"/>
+          <w:szCs w:val="28"/>
+        </w:rPr>
+        <w:t xml:space="preserve"> - ?</w:t>
       </w:r>
     </w:p>
     <w:p>
@@ -1316,133 +1298,6 @@
           <w:szCs w:val="28"/>
         </w:rPr>
       </w:pPr>
-      <w:proofErr w:type="spellStart"/>
-      <w:r>
-        <w:rPr>
-          <w:rFonts w:ascii="Arial" w:hAnsi="Arial" w:cs="Arial"/>
-          <w:sz w:val="28"/>
-          <w:szCs w:val="28"/>
-        </w:rPr>
-        <w:t>Financia</w:t>
-      </w:r>
-      <w:r>
-        <w:rPr>
-          <w:rFonts w:ascii="Arial" w:hAnsi="Arial" w:cs="Arial"/>
-          <w:sz w:val="28"/>
-          <w:szCs w:val="28"/>
-        </w:rPr>
-        <w:t>l</w:t>
-      </w:r>
-      <w:proofErr w:type="spellEnd"/>
-      <w:r>
-        <w:rPr>
-          <w:rFonts w:ascii="Arial" w:hAnsi="Arial" w:cs="Arial"/>
-          <w:sz w:val="28"/>
-          <w:szCs w:val="28"/>
-        </w:rPr>
-        <w:t xml:space="preserve"> </w:t>
-      </w:r>
-      <w:proofErr w:type="spellStart"/>
-      <w:r>
-        <w:rPr>
-          <w:rFonts w:ascii="Arial" w:hAnsi="Arial" w:cs="Arial"/>
-          <w:sz w:val="28"/>
-          <w:szCs w:val="28"/>
-        </w:rPr>
-        <w:t>and</w:t>
-      </w:r>
-      <w:proofErr w:type="spellEnd"/>
-      <w:r>
-        <w:rPr>
-          <w:rFonts w:ascii="Arial" w:hAnsi="Arial" w:cs="Arial"/>
-          <w:sz w:val="28"/>
-          <w:szCs w:val="28"/>
-        </w:rPr>
-        <w:t xml:space="preserve"> </w:t>
-      </w:r>
-      <w:proofErr w:type="spellStart"/>
-      <w:r>
-        <w:rPr>
-          <w:rFonts w:ascii="Arial" w:hAnsi="Arial" w:cs="Arial"/>
-          <w:sz w:val="28"/>
-          <w:szCs w:val="28"/>
-        </w:rPr>
-        <w:t>Work</w:t>
-      </w:r>
-      <w:proofErr w:type="spellEnd"/>
-      <w:r>
-        <w:rPr>
-          <w:rFonts w:ascii="Arial" w:hAnsi="Arial" w:cs="Arial"/>
-          <w:sz w:val="28"/>
-          <w:szCs w:val="28"/>
-        </w:rPr>
-        <w:t>/</w:t>
-      </w:r>
-      <w:proofErr w:type="spellStart"/>
-      <w:r>
-        <w:rPr>
-          <w:rFonts w:ascii="Arial" w:hAnsi="Arial" w:cs="Arial"/>
-          <w:sz w:val="28"/>
-          <w:szCs w:val="28"/>
-        </w:rPr>
-        <w:t>School_Stress</w:t>
-      </w:r>
-      <w:proofErr w:type="spellEnd"/>
-      <w:r>
-        <w:rPr>
-          <w:rFonts w:ascii="Arial" w:hAnsi="Arial" w:cs="Arial"/>
-          <w:sz w:val="28"/>
-          <w:szCs w:val="28"/>
-        </w:rPr>
-        <w:t xml:space="preserve"> - VNAŠANJE</w:t>
-      </w:r>
-    </w:p>
-    <w:p>
-      <w:pPr>
-        <w:pStyle w:val="Odstavekseznama"/>
-        <w:numPr>
-          <w:ilvl w:val="0"/>
-          <w:numId w:val="1"/>
-        </w:numPr>
-        <w:rPr>
-          <w:rFonts w:ascii="Arial" w:hAnsi="Arial" w:cs="Arial"/>
-          <w:sz w:val="28"/>
-          <w:szCs w:val="28"/>
-        </w:rPr>
-      </w:pPr>
-      <w:proofErr w:type="spellStart"/>
-      <w:r>
-        <w:rPr>
-          <w:rFonts w:ascii="Arial" w:hAnsi="Arial" w:cs="Arial"/>
-          <w:sz w:val="28"/>
-          <w:szCs w:val="28"/>
-        </w:rPr>
-        <w:t>Self_Esteem_Score</w:t>
-      </w:r>
-      <w:proofErr w:type="spellEnd"/>
-      <w:r>
-        <w:rPr>
-          <w:rFonts w:ascii="Arial" w:hAnsi="Arial" w:cs="Arial"/>
-          <w:sz w:val="28"/>
-          <w:szCs w:val="28"/>
-        </w:rPr>
-        <w:t xml:space="preserve"> - ?</w:t>
-      </w:r>
-    </w:p>
-    <w:p>
-      <w:pPr>
-        <w:pStyle w:val="Odstavekseznama"/>
-        <w:numPr>
-          <w:ilvl w:val="0"/>
-          <w:numId w:val="1"/>
-        </w:numPr>
-        <w:rPr>
-          <w:rFonts w:ascii="Arial" w:hAnsi="Arial" w:cs="Arial"/>
-          <w:sz w:val="28"/>
-          <w:szCs w:val="28"/>
-        </w:rPr>
-      </w:pPr>
-      <w:proofErr w:type="spellStart"/>
       <w:r>
         <w:rPr>
           <w:rFonts w:ascii="Arial" w:hAnsi="Arial" w:cs="Arial"/>
@@ -1451,7 +1306,6 @@
         </w:rPr>
         <w:t>Life_Satisfaction_Score</w:t>
       </w:r>
-      <w:proofErr w:type="spellEnd"/>
       <w:r>
         <w:rPr>
           <w:rFonts w:ascii="Arial" w:hAnsi="Arial" w:cs="Arial"/>
@@ -1479,7 +1333,7 @@
           <w:sz w:val="28"/>
           <w:szCs w:val="28"/>
         </w:rPr>
-        <w:t xml:space="preserve">Parametri za </w:t>
+        <w:t>Parametri za izračun</w:t>
       </w:r>
       <w:r>
         <w:rPr>
@@ -1489,7 +1343,7 @@
           <w:sz w:val="28"/>
           <w:szCs w:val="28"/>
         </w:rPr>
-        <w:t>izračun</w:t>
+        <w:t xml:space="preserve"> parametrov za zbiranje</w:t>
       </w:r>
       <w:r>
         <w:rPr>
@@ -1499,8 +1353,88 @@
           <w:sz w:val="28"/>
           <w:szCs w:val="28"/>
         </w:rPr>
-        <w:t xml:space="preserve"> parametrov za zbiranje</w:t>
-      </w:r>
+        <w:t>:</w:t>
+      </w:r>
+    </w:p>
+    <w:p>
+      <w:pPr>
+        <w:pStyle w:val="Odstavekseznama"/>
+        <w:numPr>
+          <w:ilvl w:val="0"/>
+          <w:numId w:val="1"/>
+        </w:numPr>
+        <w:rPr>
+          <w:rFonts w:ascii="Arial" w:hAnsi="Arial" w:cs="Arial"/>
+          <w:sz w:val="28"/>
+          <w:szCs w:val="28"/>
+        </w:rPr>
+      </w:pPr>
+      <w:r>
+        <w:rPr>
+          <w:rFonts w:ascii="Arial" w:hAnsi="Arial" w:cs="Arial"/>
+          <w:sz w:val="28"/>
+          <w:szCs w:val="28"/>
+        </w:rPr>
+        <w:t>Anxiety_Score</w:t>
+      </w:r>
+    </w:p>
+    <w:p>
+      <w:pPr>
+        <w:pStyle w:val="Odstavekseznama"/>
+        <w:numPr>
+          <w:ilvl w:val="0"/>
+          <w:numId w:val="1"/>
+        </w:numPr>
+        <w:rPr>
+          <w:rFonts w:ascii="Arial" w:hAnsi="Arial" w:cs="Arial"/>
+          <w:sz w:val="28"/>
+          <w:szCs w:val="28"/>
+        </w:rPr>
+      </w:pPr>
+      <w:r>
+        <w:rPr>
+          <w:rFonts w:ascii="Arial" w:hAnsi="Arial" w:cs="Arial"/>
+          <w:sz w:val="28"/>
+          <w:szCs w:val="28"/>
+        </w:rPr>
+        <w:t>Depression_Score</w:t>
+      </w:r>
+    </w:p>
+    <w:p>
+      <w:pPr>
+        <w:pStyle w:val="Odstavekseznama"/>
+        <w:numPr>
+          <w:ilvl w:val="0"/>
+          <w:numId w:val="1"/>
+        </w:numPr>
+        <w:rPr>
+          <w:rFonts w:ascii="Arial" w:hAnsi="Arial" w:cs="Arial"/>
+          <w:sz w:val="28"/>
+          <w:szCs w:val="28"/>
+        </w:rPr>
+      </w:pPr>
+      <w:r>
+        <w:rPr>
+          <w:rFonts w:ascii="Arial" w:hAnsi="Arial" w:cs="Arial"/>
+          <w:sz w:val="28"/>
+          <w:szCs w:val="28"/>
+        </w:rPr>
+        <w:t>Stress_Level</w:t>
+      </w:r>
+    </w:p>
+    <w:p>
+      <w:pPr>
+        <w:pStyle w:val="Odstavekseznama"/>
+        <w:numPr>
+          <w:ilvl w:val="0"/>
+          <w:numId w:val="1"/>
+        </w:numPr>
+        <w:rPr>
+          <w:rFonts w:ascii="Arial" w:hAnsi="Arial" w:cs="Arial"/>
+          <w:sz w:val="28"/>
+          <w:szCs w:val="28"/>
+        </w:rPr>
+      </w:pPr>
       <w:r>
         <w:rPr>
           <w:rFonts w:ascii="Arial" w:hAnsi="Arial" w:cs="Arial"/>
@@ -1509,95 +1443,8 @@
           <w:sz w:val="28"/>
           <w:szCs w:val="28"/>
         </w:rPr>
-        <w:t>:</w:t>
-      </w:r>
-    </w:p>
-    <w:p>
-      <w:pPr>
-        <w:pStyle w:val="Odstavekseznama"/>
-        <w:numPr>
-          <w:ilvl w:val="0"/>
-          <w:numId w:val="1"/>
-        </w:numPr>
-        <w:rPr>
-          <w:rFonts w:ascii="Arial" w:hAnsi="Arial" w:cs="Arial"/>
-          <w:sz w:val="28"/>
-          <w:szCs w:val="28"/>
-        </w:rPr>
-      </w:pPr>
-      <w:proofErr w:type="spellStart"/>
-      <w:r>
-        <w:rPr>
-          <w:rFonts w:ascii="Arial" w:hAnsi="Arial" w:cs="Arial"/>
-          <w:sz w:val="28"/>
-          <w:szCs w:val="28"/>
-        </w:rPr>
-        <w:t>Anxiety_Score</w:t>
-      </w:r>
-      <w:proofErr w:type="spellEnd"/>
-    </w:p>
-    <w:p>
-      <w:pPr>
-        <w:pStyle w:val="Odstavekseznama"/>
-        <w:numPr>
-          <w:ilvl w:val="0"/>
-          <w:numId w:val="1"/>
-        </w:numPr>
-        <w:rPr>
-          <w:rFonts w:ascii="Arial" w:hAnsi="Arial" w:cs="Arial"/>
-          <w:sz w:val="28"/>
-          <w:szCs w:val="28"/>
-        </w:rPr>
-      </w:pPr>
-      <w:proofErr w:type="spellStart"/>
-      <w:r>
-        <w:rPr>
-          <w:rFonts w:ascii="Arial" w:hAnsi="Arial" w:cs="Arial"/>
-          <w:sz w:val="28"/>
-          <w:szCs w:val="28"/>
-        </w:rPr>
-        <w:t>Depression_Score</w:t>
-      </w:r>
-      <w:proofErr w:type="spellEnd"/>
-    </w:p>
-    <w:p>
-      <w:pPr>
-        <w:pStyle w:val="Odstavekseznama"/>
-        <w:numPr>
-          <w:ilvl w:val="0"/>
-          <w:numId w:val="1"/>
-        </w:numPr>
-        <w:rPr>
-          <w:rFonts w:ascii="Arial" w:hAnsi="Arial" w:cs="Arial"/>
-          <w:sz w:val="28"/>
-          <w:szCs w:val="28"/>
-        </w:rPr>
-      </w:pPr>
-      <w:proofErr w:type="spellStart"/>
-      <w:r>
-        <w:rPr>
-          <w:rFonts w:ascii="Arial" w:hAnsi="Arial" w:cs="Arial"/>
-          <w:sz w:val="28"/>
-          <w:szCs w:val="28"/>
-        </w:rPr>
-        <w:t>Stress_Level</w:t>
-      </w:r>
-      <w:proofErr w:type="spellEnd"/>
-    </w:p>
-    <w:p>
-      <w:pPr>
-        <w:pStyle w:val="Odstavekseznama"/>
-        <w:numPr>
-          <w:ilvl w:val="0"/>
-          <w:numId w:val="1"/>
-        </w:numPr>
-        <w:rPr>
-          <w:rFonts w:ascii="Arial" w:hAnsi="Arial" w:cs="Arial"/>
-          <w:sz w:val="28"/>
-          <w:szCs w:val="28"/>
-        </w:rPr>
-      </w:pPr>
-      <w:proofErr w:type="spellStart"/>
+        <w:t>Mental_Health</w:t>
+      </w:r>
       <w:r>
         <w:rPr>
           <w:rFonts w:ascii="Arial" w:hAnsi="Arial" w:cs="Arial"/>
@@ -1606,9 +1453,35 @@
           <w:sz w:val="28"/>
           <w:szCs w:val="28"/>
         </w:rPr>
-        <w:t>Mental_Health</w:t>
-      </w:r>
-      <w:r>
+        <w:t>_Score</w:t>
+      </w:r>
+      <w:r>
+        <w:rPr>
+          <w:rFonts w:ascii="Arial" w:hAnsi="Arial" w:cs="Arial"/>
+          <w:sz w:val="28"/>
+          <w:szCs w:val="28"/>
+        </w:rPr>
+        <w:t xml:space="preserve"> (vse zgornje skupaj </w:t>
+      </w:r>
+      <w:r>
+        <w:rPr>
+          <w:rFonts w:ascii="Arial" w:hAnsi="Arial" w:cs="Arial"/>
+          <w:sz w:val="28"/>
+          <w:szCs w:val="28"/>
+        </w:rPr>
+        <w:t xml:space="preserve">se zračunajo </w:t>
+      </w:r>
+      <w:r>
+        <w:rPr>
+          <w:rFonts w:ascii="Arial" w:hAnsi="Arial" w:cs="Arial"/>
+          <w:sz w:val="28"/>
+          <w:szCs w:val="28"/>
+        </w:rPr>
+        <w:t>v to)</w:t>
+      </w:r>
+    </w:p>
+    <w:p>
+      <w:pPr>
         <w:rPr>
           <w:rFonts w:ascii="Arial" w:hAnsi="Arial" w:cs="Arial"/>
           <w:b/>
@@ -1616,36 +1489,8 @@
           <w:sz w:val="28"/>
           <w:szCs w:val="28"/>
         </w:rPr>
-        <w:t>_Score</w:t>
-      </w:r>
-      <w:proofErr w:type="spellEnd"/>
-      <w:r>
-        <w:rPr>
-          <w:rFonts w:ascii="Arial" w:hAnsi="Arial" w:cs="Arial"/>
-          <w:sz w:val="28"/>
-          <w:szCs w:val="28"/>
-        </w:rPr>
-        <w:t xml:space="preserve"> (vse zgornje skupaj </w:t>
-      </w:r>
-      <w:r>
-        <w:rPr>
-          <w:rFonts w:ascii="Arial" w:hAnsi="Arial" w:cs="Arial"/>
-          <w:sz w:val="28"/>
-          <w:szCs w:val="28"/>
-        </w:rPr>
-        <w:t xml:space="preserve">se zračunajo </w:t>
-      </w:r>
-      <w:r>
-        <w:rPr>
-          <w:rFonts w:ascii="Arial" w:hAnsi="Arial" w:cs="Arial"/>
-          <w:sz w:val="28"/>
-          <w:szCs w:val="28"/>
-        </w:rPr>
-        <w:t>v to)</w:t>
-      </w:r>
-    </w:p>
-    <w:p>
-      <w:pPr>
+      </w:pPr>
+      <w:r>
         <w:rPr>
           <w:rFonts w:ascii="Arial" w:hAnsi="Arial" w:cs="Arial"/>
           <w:b/>
@@ -1653,7 +1498,9 @@
           <w:sz w:val="28"/>
           <w:szCs w:val="28"/>
         </w:rPr>
-      </w:pPr>
+        <w:lastRenderedPageBreak/>
+        <w:t xml:space="preserve">Mobilna </w:t>
+      </w:r>
       <w:r>
         <w:rPr>
           <w:rFonts w:ascii="Arial" w:hAnsi="Arial" w:cs="Arial"/>
@@ -1662,8 +1509,7 @@
           <w:sz w:val="28"/>
           <w:szCs w:val="28"/>
         </w:rPr>
-        <w:lastRenderedPageBreak/>
-        <w:t xml:space="preserve">Mobilna </w:t>
+        <w:t>aplikacij</w:t>
       </w:r>
       <w:r>
         <w:rPr>
@@ -1673,7 +1519,7 @@
           <w:sz w:val="28"/>
           <w:szCs w:val="28"/>
         </w:rPr>
-        <w:t>aplikacij</w:t>
+        <w:t>a</w:t>
       </w:r>
       <w:r>
         <w:rPr>
@@ -1683,7 +1529,7 @@
           <w:sz w:val="28"/>
           <w:szCs w:val="28"/>
         </w:rPr>
-        <w:t>a</w:t>
+        <w:t xml:space="preserve"> (potek)</w:t>
       </w:r>
       <w:r>
         <w:rPr>
@@ -1693,16 +1539,6 @@
           <w:sz w:val="28"/>
           <w:szCs w:val="28"/>
         </w:rPr>
-        <w:t xml:space="preserve"> (potek)</w:t>
-      </w:r>
-      <w:r>
-        <w:rPr>
-          <w:rFonts w:ascii="Arial" w:hAnsi="Arial" w:cs="Arial"/>
-          <w:b/>
-          <w:bCs/>
-          <w:sz w:val="28"/>
-          <w:szCs w:val="28"/>
-        </w:rPr>
         <w:t>:</w:t>
       </w:r>
     </w:p>
@@ -1749,7 +1585,6 @@
         </w:rPr>
         <w:t>'</w:t>
       </w:r>
-      <w:proofErr w:type="spellStart"/>
       <w:r>
         <w:rPr>
           <w:rFonts w:ascii="Arial" w:hAnsi="Arial" w:cs="Arial"/>
@@ -1758,7 +1593,6 @@
         </w:rPr>
         <w:t>Login</w:t>
       </w:r>
-      <w:proofErr w:type="spellEnd"/>
       <w:r>
         <w:rPr>
           <w:rFonts w:ascii="Arial" w:hAnsi="Arial" w:cs="Arial"/>
@@ -1809,25 +1643,7 @@
           <w:sz w:val="28"/>
           <w:szCs w:val="28"/>
         </w:rPr>
-        <w:t xml:space="preserve">Home </w:t>
-      </w:r>
-      <w:proofErr w:type="spellStart"/>
-      <w:r>
-        <w:rPr>
-          <w:rFonts w:ascii="Arial" w:hAnsi="Arial" w:cs="Arial"/>
-          <w:sz w:val="28"/>
-          <w:szCs w:val="28"/>
-        </w:rPr>
-        <w:t>page</w:t>
-      </w:r>
-      <w:proofErr w:type="spellEnd"/>
-      <w:r>
-        <w:rPr>
-          <w:rFonts w:ascii="Arial" w:hAnsi="Arial" w:cs="Arial"/>
-          <w:sz w:val="28"/>
-          <w:szCs w:val="28"/>
-        </w:rPr>
-        <w:t xml:space="preserve"> z grafi</w:t>
+        <w:t>Home page z grafi</w:t>
       </w:r>
     </w:p>
     <w:p>
@@ -1921,9 +1737,8 @@
           <w:sz w:val="28"/>
           <w:szCs w:val="28"/>
         </w:rPr>
-        <w:t xml:space="preserve"> (</w:t>
-      </w:r>
-      <w:proofErr w:type="spellStart"/>
+        <w:t xml:space="preserve"> (features)</w:t>
+      </w:r>
       <w:r>
         <w:rPr>
           <w:rFonts w:ascii="Arial" w:hAnsi="Arial" w:cs="Arial"/>
@@ -1932,9 +1747,98 @@
           <w:sz w:val="28"/>
           <w:szCs w:val="28"/>
         </w:rPr>
-        <w:t>features</w:t>
-      </w:r>
-      <w:proofErr w:type="spellEnd"/>
+        <w:t>:</w:t>
+      </w:r>
+    </w:p>
+    <w:p>
+      <w:pPr>
+        <w:pStyle w:val="Odstavekseznama"/>
+        <w:numPr>
+          <w:ilvl w:val="0"/>
+          <w:numId w:val="1"/>
+        </w:numPr>
+        <w:rPr>
+          <w:rFonts w:ascii="Arial" w:hAnsi="Arial" w:cs="Arial"/>
+          <w:sz w:val="28"/>
+          <w:szCs w:val="28"/>
+        </w:rPr>
+      </w:pPr>
+      <w:r>
+        <w:rPr>
+          <w:rFonts w:ascii="Arial" w:hAnsi="Arial" w:cs="Arial"/>
+          <w:sz w:val="28"/>
+          <w:szCs w:val="28"/>
+        </w:rPr>
+        <w:t>Home page</w:t>
+      </w:r>
+      <w:r>
+        <w:rPr>
+          <w:rFonts w:ascii="Arial" w:hAnsi="Arial" w:cs="Arial"/>
+          <w:sz w:val="28"/>
+          <w:szCs w:val="28"/>
+        </w:rPr>
+        <w:t>:</w:t>
+      </w:r>
+    </w:p>
+    <w:p>
+      <w:pPr>
+        <w:pStyle w:val="Odstavekseznama"/>
+        <w:numPr>
+          <w:ilvl w:val="1"/>
+          <w:numId w:val="1"/>
+        </w:numPr>
+        <w:rPr>
+          <w:rFonts w:ascii="Arial" w:hAnsi="Arial" w:cs="Arial"/>
+          <w:sz w:val="28"/>
+          <w:szCs w:val="28"/>
+        </w:rPr>
+      </w:pPr>
+      <w:r>
+        <w:rPr>
+          <w:rFonts w:ascii="Arial" w:hAnsi="Arial" w:cs="Arial"/>
+          <w:sz w:val="28"/>
+          <w:szCs w:val="28"/>
+        </w:rPr>
+        <w:t xml:space="preserve">predstavi nekaj najpomembnejših podatkov in </w:t>
+      </w:r>
+      <w:r>
+        <w:rPr>
+          <w:rFonts w:ascii="Arial" w:hAnsi="Arial" w:cs="Arial"/>
+          <w:sz w:val="28"/>
+          <w:szCs w:val="28"/>
+        </w:rPr>
+        <w:t>vsebuje povezave na druge strani</w:t>
+      </w:r>
+      <w:r>
+        <w:rPr>
+          <w:rFonts w:ascii="Arial" w:hAnsi="Arial" w:cs="Arial"/>
+          <w:sz w:val="28"/>
+          <w:szCs w:val="28"/>
+        </w:rPr>
+        <w:t xml:space="preserve"> (gumbi/polja)</w:t>
+      </w:r>
+    </w:p>
+    <w:p>
+      <w:pPr>
+        <w:pStyle w:val="Odstavekseznama"/>
+        <w:numPr>
+          <w:ilvl w:val="1"/>
+          <w:numId w:val="1"/>
+        </w:numPr>
+        <w:rPr>
+          <w:rFonts w:ascii="Arial" w:hAnsi="Arial" w:cs="Arial"/>
+          <w:sz w:val="28"/>
+          <w:szCs w:val="28"/>
+        </w:rPr>
+      </w:pPr>
+      <w:r>
+        <w:rPr>
+          <w:rFonts w:ascii="Arial" w:hAnsi="Arial" w:cs="Arial"/>
+          <w:sz w:val="28"/>
+          <w:szCs w:val="28"/>
+        </w:rPr>
+        <w:t>prikazuje '</w:t>
+      </w:r>
       <w:r>
         <w:rPr>
           <w:rFonts w:ascii="Arial" w:hAnsi="Arial" w:cs="Arial"/>
@@ -1943,17 +1847,91 @@
           <w:sz w:val="28"/>
           <w:szCs w:val="28"/>
         </w:rPr>
-        <w:t>)</w:t>
-      </w:r>
-      <w:r>
-        <w:rPr>
-          <w:rFonts w:ascii="Arial" w:hAnsi="Arial" w:cs="Arial"/>
-          <w:b/>
-          <w:bCs/>
-          <w:sz w:val="28"/>
-          <w:szCs w:val="28"/>
-        </w:rPr>
-        <w:t>:</w:t>
+        <w:t>Mental_Health_Score</w:t>
+      </w:r>
+      <w:r>
+        <w:rPr>
+          <w:rFonts w:ascii="Arial" w:hAnsi="Arial" w:cs="Arial"/>
+          <w:sz w:val="28"/>
+          <w:szCs w:val="28"/>
+        </w:rPr>
+        <w:t>'</w:t>
+      </w:r>
+    </w:p>
+    <w:p>
+      <w:pPr>
+        <w:pStyle w:val="Odstavekseznama"/>
+        <w:numPr>
+          <w:ilvl w:val="1"/>
+          <w:numId w:val="1"/>
+        </w:numPr>
+        <w:rPr>
+          <w:rFonts w:ascii="Arial" w:hAnsi="Arial" w:cs="Arial"/>
+          <w:sz w:val="28"/>
+          <w:szCs w:val="28"/>
+        </w:rPr>
+      </w:pPr>
+      <w:r>
+        <w:rPr>
+          <w:rFonts w:ascii="Arial" w:hAnsi="Arial" w:cs="Arial"/>
+          <w:sz w:val="28"/>
+          <w:szCs w:val="28"/>
+        </w:rPr>
+        <w:t xml:space="preserve">prikazuje </w:t>
+      </w:r>
+      <w:r>
+        <w:rPr>
+          <w:rFonts w:ascii="Arial" w:hAnsi="Arial" w:cs="Arial"/>
+          <w:sz w:val="28"/>
+          <w:szCs w:val="28"/>
+        </w:rPr>
+        <w:t>povezav</w:t>
+      </w:r>
+      <w:r>
+        <w:rPr>
+          <w:rFonts w:ascii="Arial" w:hAnsi="Arial" w:cs="Arial"/>
+          <w:sz w:val="28"/>
+          <w:szCs w:val="28"/>
+        </w:rPr>
+        <w:t>e</w:t>
+      </w:r>
+      <w:r>
+        <w:rPr>
+          <w:rFonts w:ascii="Arial" w:hAnsi="Arial" w:cs="Arial"/>
+          <w:sz w:val="28"/>
+          <w:szCs w:val="28"/>
+        </w:rPr>
+        <w:t xml:space="preserve"> na nasvete</w:t>
+      </w:r>
+      <w:r>
+        <w:rPr>
+          <w:rFonts w:ascii="Arial" w:hAnsi="Arial" w:cs="Arial"/>
+          <w:sz w:val="28"/>
+          <w:szCs w:val="28"/>
+        </w:rPr>
+        <w:t>, članke</w:t>
+      </w:r>
+    </w:p>
+    <w:p>
+      <w:pPr>
+        <w:pStyle w:val="Odstavekseznama"/>
+        <w:numPr>
+          <w:ilvl w:val="1"/>
+          <w:numId w:val="1"/>
+        </w:numPr>
+        <w:rPr>
+          <w:rFonts w:ascii="Arial" w:hAnsi="Arial" w:cs="Arial"/>
+          <w:sz w:val="28"/>
+          <w:szCs w:val="28"/>
+        </w:rPr>
+      </w:pPr>
+      <w:r>
+        <w:rPr>
+          <w:rFonts w:ascii="Arial" w:hAnsi="Arial" w:cs="Arial"/>
+          <w:sz w:val="28"/>
+          <w:szCs w:val="28"/>
+        </w:rPr>
+        <w:t>Prikaže ti tudi značke, ki si jih že dobil, ali pa si na dobri poti, da jih boš dobil</w:t>
       </w:r>
     </w:p>
     <w:p>
@@ -1975,25 +1953,7 @@
           <w:sz w:val="28"/>
           <w:szCs w:val="28"/>
         </w:rPr>
-        <w:t xml:space="preserve">Home </w:t>
-      </w:r>
-      <w:proofErr w:type="spellStart"/>
-      <w:r>
-        <w:rPr>
-          <w:rFonts w:ascii="Arial" w:hAnsi="Arial" w:cs="Arial"/>
-          <w:sz w:val="28"/>
-          <w:szCs w:val="28"/>
-        </w:rPr>
-        <w:t>page</w:t>
-      </w:r>
-      <w:proofErr w:type="spellEnd"/>
-      <w:r>
-        <w:rPr>
-          <w:rFonts w:ascii="Arial" w:hAnsi="Arial" w:cs="Arial"/>
-          <w:sz w:val="28"/>
-          <w:szCs w:val="28"/>
-        </w:rPr>
-        <w:t>:</w:t>
+        <w:t>Mental_Health_Score page:</w:t>
       </w:r>
     </w:p>
     <w:p>
@@ -2015,260 +1975,8 @@
           <w:sz w:val="28"/>
           <w:szCs w:val="28"/>
         </w:rPr>
-        <w:t xml:space="preserve">predstavi nekaj najpomembnejših podatkov in </w:t>
-      </w:r>
-      <w:r>
-        <w:rPr>
-          <w:rFonts w:ascii="Arial" w:hAnsi="Arial" w:cs="Arial"/>
-          <w:sz w:val="28"/>
-          <w:szCs w:val="28"/>
-        </w:rPr>
-        <w:t>vsebuje povezave na druge strani</w:t>
-      </w:r>
-      <w:r>
-        <w:rPr>
-          <w:rFonts w:ascii="Arial" w:hAnsi="Arial" w:cs="Arial"/>
-          <w:sz w:val="28"/>
-          <w:szCs w:val="28"/>
-        </w:rPr>
-        <w:t xml:space="preserve"> (gumbi/polja)</w:t>
-      </w:r>
-    </w:p>
-    <w:p>
-      <w:pPr>
-        <w:pStyle w:val="Odstavekseznama"/>
-        <w:numPr>
-          <w:ilvl w:val="1"/>
-          <w:numId w:val="1"/>
-        </w:numPr>
-        <w:rPr>
-          <w:rFonts w:ascii="Arial" w:hAnsi="Arial" w:cs="Arial"/>
-          <w:sz w:val="28"/>
-          <w:szCs w:val="28"/>
-        </w:rPr>
-      </w:pPr>
-      <w:r>
-        <w:rPr>
-          <w:rFonts w:ascii="Arial" w:hAnsi="Arial" w:cs="Arial"/>
-          <w:sz w:val="28"/>
-          <w:szCs w:val="28"/>
-        </w:rPr>
-        <w:t>prikazuje '</w:t>
-      </w:r>
-      <w:proofErr w:type="spellStart"/>
-      <w:r>
-        <w:rPr>
-          <w:rFonts w:ascii="Arial" w:hAnsi="Arial" w:cs="Arial"/>
-          <w:b/>
-          <w:bCs/>
-          <w:sz w:val="28"/>
-          <w:szCs w:val="28"/>
-        </w:rPr>
-        <w:t>Mental_Health_Score</w:t>
-      </w:r>
-      <w:proofErr w:type="spellEnd"/>
-      <w:r>
-        <w:rPr>
-          <w:rFonts w:ascii="Arial" w:hAnsi="Arial" w:cs="Arial"/>
-          <w:sz w:val="28"/>
-          <w:szCs w:val="28"/>
-        </w:rPr>
-        <w:t>'</w:t>
-      </w:r>
-    </w:p>
-    <w:p>
-      <w:pPr>
-        <w:pStyle w:val="Odstavekseznama"/>
-        <w:numPr>
-          <w:ilvl w:val="1"/>
-          <w:numId w:val="1"/>
-        </w:numPr>
-        <w:rPr>
-          <w:rFonts w:ascii="Arial" w:hAnsi="Arial" w:cs="Arial"/>
-          <w:sz w:val="28"/>
-          <w:szCs w:val="28"/>
-        </w:rPr>
-      </w:pPr>
-      <w:r>
-        <w:rPr>
-          <w:rFonts w:ascii="Arial" w:hAnsi="Arial" w:cs="Arial"/>
-          <w:sz w:val="28"/>
-          <w:szCs w:val="28"/>
-        </w:rPr>
-        <w:t xml:space="preserve">prikazuje </w:t>
-      </w:r>
-      <w:r>
-        <w:rPr>
-          <w:rFonts w:ascii="Arial" w:hAnsi="Arial" w:cs="Arial"/>
-          <w:sz w:val="28"/>
-          <w:szCs w:val="28"/>
-        </w:rPr>
-        <w:t>povezav</w:t>
-      </w:r>
-      <w:r>
-        <w:rPr>
-          <w:rFonts w:ascii="Arial" w:hAnsi="Arial" w:cs="Arial"/>
-          <w:sz w:val="28"/>
-          <w:szCs w:val="28"/>
-        </w:rPr>
-        <w:t>e</w:t>
-      </w:r>
-      <w:r>
-        <w:rPr>
-          <w:rFonts w:ascii="Arial" w:hAnsi="Arial" w:cs="Arial"/>
-          <w:sz w:val="28"/>
-          <w:szCs w:val="28"/>
-        </w:rPr>
-        <w:t xml:space="preserve"> na nasvete</w:t>
-      </w:r>
-      <w:r>
-        <w:rPr>
-          <w:rFonts w:ascii="Arial" w:hAnsi="Arial" w:cs="Arial"/>
-          <w:sz w:val="28"/>
-          <w:szCs w:val="28"/>
-        </w:rPr>
-        <w:t>, članke</w:t>
-      </w:r>
-    </w:p>
-    <w:p>
-      <w:pPr>
-        <w:pStyle w:val="Odstavekseznama"/>
-        <w:numPr>
-          <w:ilvl w:val="1"/>
-          <w:numId w:val="1"/>
-        </w:numPr>
-        <w:rPr>
-          <w:rFonts w:ascii="Arial" w:hAnsi="Arial" w:cs="Arial"/>
-          <w:sz w:val="28"/>
-          <w:szCs w:val="28"/>
-        </w:rPr>
-      </w:pPr>
-      <w:r>
-        <w:rPr>
-          <w:rFonts w:ascii="Arial" w:hAnsi="Arial" w:cs="Arial"/>
-          <w:sz w:val="28"/>
-          <w:szCs w:val="28"/>
-        </w:rPr>
-        <w:t>Prikaže ti tudi značke, ki si jih že dobil, ali pa si na dobri poti, da jih boš dobil</w:t>
-      </w:r>
-    </w:p>
-    <w:p>
-      <w:pPr>
-        <w:pStyle w:val="Odstavekseznama"/>
-        <w:numPr>
-          <w:ilvl w:val="0"/>
-          <w:numId w:val="1"/>
-        </w:numPr>
-        <w:rPr>
-          <w:rFonts w:ascii="Arial" w:hAnsi="Arial" w:cs="Arial"/>
-          <w:sz w:val="28"/>
-          <w:szCs w:val="28"/>
-        </w:rPr>
-      </w:pPr>
-      <w:proofErr w:type="spellStart"/>
-      <w:r>
-        <w:rPr>
-          <w:rFonts w:ascii="Arial" w:hAnsi="Arial" w:cs="Arial"/>
-          <w:sz w:val="28"/>
-          <w:szCs w:val="28"/>
-        </w:rPr>
-        <w:t>Mental_Health_Score</w:t>
-      </w:r>
-      <w:proofErr w:type="spellEnd"/>
-      <w:r>
-        <w:rPr>
-          <w:rFonts w:ascii="Arial" w:hAnsi="Arial" w:cs="Arial"/>
-          <w:sz w:val="28"/>
-          <w:szCs w:val="28"/>
-        </w:rPr>
-        <w:t xml:space="preserve"> </w:t>
-      </w:r>
-      <w:proofErr w:type="spellStart"/>
-      <w:r>
-        <w:rPr>
-          <w:rFonts w:ascii="Arial" w:hAnsi="Arial" w:cs="Arial"/>
-          <w:sz w:val="28"/>
-          <w:szCs w:val="28"/>
-        </w:rPr>
-        <w:t>page</w:t>
-      </w:r>
-      <w:proofErr w:type="spellEnd"/>
-      <w:r>
-        <w:rPr>
-          <w:rFonts w:ascii="Arial" w:hAnsi="Arial" w:cs="Arial"/>
-          <w:sz w:val="28"/>
-          <w:szCs w:val="28"/>
-        </w:rPr>
-        <w:t>:</w:t>
-      </w:r>
-    </w:p>
-    <w:p>
-      <w:pPr>
-        <w:pStyle w:val="Odstavekseznama"/>
-        <w:numPr>
-          <w:ilvl w:val="1"/>
-          <w:numId w:val="1"/>
-        </w:numPr>
-        <w:rPr>
-          <w:rFonts w:ascii="Arial" w:hAnsi="Arial" w:cs="Arial"/>
-          <w:sz w:val="28"/>
-          <w:szCs w:val="28"/>
-        </w:rPr>
-      </w:pPr>
-      <w:r>
-        <w:rPr>
-          <w:rFonts w:ascii="Arial" w:hAnsi="Arial" w:cs="Arial"/>
-          <w:sz w:val="28"/>
-          <w:szCs w:val="28"/>
-        </w:rPr>
-        <w:t xml:space="preserve">Na vrhu je </w:t>
-      </w:r>
-      <w:proofErr w:type="spellStart"/>
-      <w:r>
-        <w:rPr>
-          <w:rFonts w:ascii="Arial" w:hAnsi="Arial" w:cs="Arial"/>
-          <w:sz w:val="28"/>
-          <w:szCs w:val="28"/>
-        </w:rPr>
-        <w:t>Mental</w:t>
-      </w:r>
-      <w:proofErr w:type="spellEnd"/>
-      <w:r>
-        <w:rPr>
-          <w:rFonts w:ascii="Arial" w:hAnsi="Arial" w:cs="Arial"/>
-          <w:sz w:val="28"/>
-          <w:szCs w:val="28"/>
-        </w:rPr>
-        <w:t xml:space="preserve"> </w:t>
-      </w:r>
-      <w:proofErr w:type="spellStart"/>
-      <w:r>
-        <w:rPr>
-          <w:rFonts w:ascii="Arial" w:hAnsi="Arial" w:cs="Arial"/>
-          <w:sz w:val="28"/>
-          <w:szCs w:val="28"/>
-        </w:rPr>
-        <w:t>Health</w:t>
-      </w:r>
-      <w:proofErr w:type="spellEnd"/>
-      <w:r>
-        <w:rPr>
-          <w:rFonts w:ascii="Arial" w:hAnsi="Arial" w:cs="Arial"/>
-          <w:sz w:val="28"/>
-          <w:szCs w:val="28"/>
-        </w:rPr>
-        <w:t xml:space="preserve"> </w:t>
-      </w:r>
-      <w:proofErr w:type="spellStart"/>
-      <w:r>
-        <w:rPr>
-          <w:rFonts w:ascii="Arial" w:hAnsi="Arial" w:cs="Arial"/>
-          <w:sz w:val="28"/>
-          <w:szCs w:val="28"/>
-        </w:rPr>
-        <w:t>Score</w:t>
-      </w:r>
-      <w:proofErr w:type="spellEnd"/>
+        <w:t>Na vrhu je Mental Health Score</w:t>
+      </w:r>
       <w:r>
         <w:rPr>
           <w:rFonts w:ascii="Arial" w:hAnsi="Arial" w:cs="Arial"/>
@@ -2291,43 +1999,7 @@
           <w:sz w:val="28"/>
           <w:szCs w:val="28"/>
         </w:rPr>
-        <w:t xml:space="preserve"> in ti napiše v kateri kategoriji si (</w:t>
-      </w:r>
-      <w:proofErr w:type="spellStart"/>
-      <w:r>
-        <w:rPr>
-          <w:rFonts w:ascii="Arial" w:hAnsi="Arial" w:cs="Arial"/>
-          <w:sz w:val="28"/>
-          <w:szCs w:val="28"/>
-        </w:rPr>
-        <w:t>excellent</w:t>
-      </w:r>
-      <w:proofErr w:type="spellEnd"/>
-      <w:r>
-        <w:rPr>
-          <w:rFonts w:ascii="Arial" w:hAnsi="Arial" w:cs="Arial"/>
-          <w:sz w:val="28"/>
-          <w:szCs w:val="28"/>
-        </w:rPr>
-        <w:t xml:space="preserve"> </w:t>
-      </w:r>
-      <w:proofErr w:type="spellStart"/>
-      <w:r>
-        <w:rPr>
-          <w:rFonts w:ascii="Arial" w:hAnsi="Arial" w:cs="Arial"/>
-          <w:sz w:val="28"/>
-          <w:szCs w:val="28"/>
-        </w:rPr>
-        <w:t>health</w:t>
-      </w:r>
-      <w:proofErr w:type="spellEnd"/>
-      <w:r>
-        <w:rPr>
-          <w:rFonts w:ascii="Arial" w:hAnsi="Arial" w:cs="Arial"/>
-          <w:sz w:val="28"/>
-          <w:szCs w:val="28"/>
-        </w:rPr>
-        <w:t xml:space="preserve"> ipd.)</w:t>
+        <w:t xml:space="preserve"> in ti napiše v kateri kategoriji si (excellent health ipd.)</w:t>
       </w:r>
     </w:p>
     <w:p>
@@ -2459,25 +2131,7 @@
           <w:sz w:val="28"/>
           <w:szCs w:val="28"/>
         </w:rPr>
-        <w:t xml:space="preserve"> (spanje, stres, '</w:t>
-      </w:r>
-      <w:proofErr w:type="spellStart"/>
-      <w:r>
-        <w:rPr>
-          <w:rFonts w:ascii="Arial" w:hAnsi="Arial" w:cs="Arial"/>
-          <w:sz w:val="28"/>
-          <w:szCs w:val="28"/>
-        </w:rPr>
-        <w:t>anxiety</w:t>
-      </w:r>
-      <w:proofErr w:type="spellEnd"/>
-      <w:r>
-        <w:rPr>
-          <w:rFonts w:ascii="Arial" w:hAnsi="Arial" w:cs="Arial"/>
-          <w:sz w:val="28"/>
-          <w:szCs w:val="28"/>
-        </w:rPr>
-        <w:t>'</w:t>
+        <w:t xml:space="preserve"> (spanje, stres, 'anxiety'</w:t>
       </w:r>
       <w:r>
         <w:rPr>
@@ -2748,25 +2402,7 @@
           <w:sz w:val="28"/>
           <w:szCs w:val="28"/>
         </w:rPr>
-        <w:t>Če aplikacija opazi, da si manj časa porabil na napravi in da so koraki šli gor, te aplikacija vpraša, če si izvajal kakšno aktivnost (lahko odgovoriš kaj (</w:t>
-      </w:r>
-      <w:proofErr w:type="spellStart"/>
-      <w:r>
-        <w:rPr>
-          <w:rFonts w:ascii="Arial" w:hAnsi="Arial" w:cs="Arial"/>
-          <w:sz w:val="28"/>
-          <w:szCs w:val="28"/>
-        </w:rPr>
-        <w:t>dropdown</w:t>
-      </w:r>
-      <w:proofErr w:type="spellEnd"/>
-      <w:r>
-        <w:rPr>
-          <w:rFonts w:ascii="Arial" w:hAnsi="Arial" w:cs="Arial"/>
-          <w:sz w:val="28"/>
-          <w:szCs w:val="28"/>
-        </w:rPr>
-        <w:t xml:space="preserve"> meni) ali SKIP) – Uporabnik lahko nato vse ta opažanja vidi v listu Dosežki gibanja (kateri dan/datum)</w:t>
+        <w:t>Če aplikacija opazi, da si manj časa porabil na napravi in da so koraki šli gor, te aplikacija vpraša, če si izvajal kakšno aktivnost (lahko odgovoriš kaj (dropdown meni) ali SKIP) – Uporabnik lahko nato vse ta opažanja vidi v listu Dosežki gibanja (kateri dan/datum)</w:t>
       </w:r>
     </w:p>
     <w:p>
@@ -2788,31 +2424,7 @@
           <w:sz w:val="28"/>
           <w:szCs w:val="28"/>
         </w:rPr>
-        <w:t>S</w:t>
-      </w:r>
-      <w:r>
-        <w:rPr>
-          <w:rFonts w:ascii="Arial" w:hAnsi="Arial" w:cs="Arial"/>
-          <w:sz w:val="28"/>
-          <w:szCs w:val="28"/>
-        </w:rPr>
-        <w:t>tran</w:t>
-      </w:r>
-      <w:r>
-        <w:rPr>
-          <w:rFonts w:ascii="Arial" w:hAnsi="Arial" w:cs="Arial"/>
-          <w:sz w:val="28"/>
-          <w:szCs w:val="28"/>
-        </w:rPr>
-        <w:t xml:space="preserve"> za dosežke</w:t>
-      </w:r>
-      <w:r>
-        <w:rPr>
-          <w:rFonts w:ascii="Arial" w:hAnsi="Arial" w:cs="Arial"/>
-          <w:sz w:val="28"/>
-          <w:szCs w:val="28"/>
-        </w:rPr>
-        <w:t>:</w:t>
+        <w:t>Stran za dosežke:</w:t>
       </w:r>
     </w:p>
     <w:p>
@@ -2842,43 +2454,7 @@
           <w:sz w:val="28"/>
           <w:szCs w:val="28"/>
         </w:rPr>
-        <w:t xml:space="preserve"> (glej </w:t>
-      </w:r>
-      <w:proofErr w:type="spellStart"/>
-      <w:r>
-        <w:rPr>
-          <w:rFonts w:ascii="Arial" w:hAnsi="Arial" w:cs="Arial"/>
-          <w:sz w:val="28"/>
-          <w:szCs w:val="28"/>
-        </w:rPr>
-        <w:t>steam</w:t>
-      </w:r>
-      <w:proofErr w:type="spellEnd"/>
-      <w:r>
-        <w:rPr>
-          <w:rFonts w:ascii="Arial" w:hAnsi="Arial" w:cs="Arial"/>
-          <w:sz w:val="28"/>
-          <w:szCs w:val="28"/>
-        </w:rPr>
-        <w:t xml:space="preserve"> </w:t>
-      </w:r>
-      <w:proofErr w:type="spellStart"/>
-      <w:r>
-        <w:rPr>
-          <w:rFonts w:ascii="Arial" w:hAnsi="Arial" w:cs="Arial"/>
-          <w:sz w:val="28"/>
-          <w:szCs w:val="28"/>
-        </w:rPr>
-        <w:t>achievements</w:t>
-      </w:r>
-      <w:proofErr w:type="spellEnd"/>
-      <w:r>
-        <w:rPr>
-          <w:rFonts w:ascii="Arial" w:hAnsi="Arial" w:cs="Arial"/>
-          <w:sz w:val="28"/>
-          <w:szCs w:val="28"/>
-        </w:rPr>
-        <w:t>)</w:t>
+        <w:t xml:space="preserve"> (glej steam achievements)</w:t>
       </w:r>
     </w:p>
     <w:p>
@@ -2980,23 +2556,13 @@
           <w:szCs w:val="28"/>
         </w:rPr>
       </w:pPr>
-      <w:proofErr w:type="spellStart"/>
-      <w:r>
-        <w:rPr>
-          <w:rFonts w:ascii="Arial" w:hAnsi="Arial" w:cs="Arial"/>
-          <w:sz w:val="28"/>
-          <w:szCs w:val="28"/>
-        </w:rPr>
-        <w:t>Profilna</w:t>
-      </w:r>
-      <w:proofErr w:type="spellEnd"/>
-      <w:r>
-        <w:rPr>
-          <w:rFonts w:ascii="Arial" w:hAnsi="Arial" w:cs="Arial"/>
-          <w:sz w:val="28"/>
-          <w:szCs w:val="28"/>
-        </w:rPr>
-        <w:t xml:space="preserve"> stran</w:t>
+      <w:r>
+        <w:rPr>
+          <w:rFonts w:ascii="Arial" w:hAnsi="Arial" w:cs="Arial"/>
+          <w:sz w:val="28"/>
+          <w:szCs w:val="28"/>
+        </w:rPr>
+        <w:t>Profilna stran</w:t>
       </w:r>
       <w:r>
         <w:rPr>
@@ -3106,25 +2672,7 @@
           <w:sz w:val="28"/>
           <w:szCs w:val="28"/>
         </w:rPr>
-        <w:t>'</w:t>
-      </w:r>
-      <w:proofErr w:type="spellStart"/>
-      <w:r>
-        <w:rPr>
-          <w:rFonts w:ascii="Arial" w:hAnsi="Arial" w:cs="Arial"/>
-          <w:sz w:val="28"/>
-          <w:szCs w:val="28"/>
-        </w:rPr>
-        <w:t>Introduction</w:t>
-      </w:r>
-      <w:proofErr w:type="spellEnd"/>
-      <w:r>
-        <w:rPr>
-          <w:rFonts w:ascii="Arial" w:hAnsi="Arial" w:cs="Arial"/>
-          <w:sz w:val="28"/>
-          <w:szCs w:val="28"/>
-        </w:rPr>
-        <w:t>' v aplikacijo</w:t>
+        <w:t>'Introduction' v aplikacijo</w:t>
       </w:r>
     </w:p>
     <w:p>
@@ -3216,25 +2764,7 @@
           <w:sz w:val="28"/>
           <w:szCs w:val="28"/>
         </w:rPr>
-        <w:t>'</w:t>
-      </w:r>
-      <w:proofErr w:type="spellStart"/>
-      <w:r>
-        <w:rPr>
-          <w:rFonts w:ascii="Arial" w:hAnsi="Arial" w:cs="Arial"/>
-          <w:sz w:val="28"/>
-          <w:szCs w:val="28"/>
-        </w:rPr>
-        <w:t>Login</w:t>
-      </w:r>
-      <w:proofErr w:type="spellEnd"/>
-      <w:r>
-        <w:rPr>
-          <w:rFonts w:ascii="Arial" w:hAnsi="Arial" w:cs="Arial"/>
-          <w:sz w:val="28"/>
-          <w:szCs w:val="28"/>
-        </w:rPr>
-        <w:t>'</w:t>
+        <w:t>'Login'</w:t>
       </w:r>
       <w:r>
         <w:rPr>
@@ -3357,61 +2887,7 @@
           <w:sz w:val="28"/>
           <w:szCs w:val="28"/>
         </w:rPr>
-        <w:t>MERN (</w:t>
-      </w:r>
-      <w:proofErr w:type="spellStart"/>
-      <w:r>
-        <w:rPr>
-          <w:rFonts w:ascii="Arial" w:hAnsi="Arial" w:cs="Arial"/>
-          <w:sz w:val="28"/>
-          <w:szCs w:val="28"/>
-        </w:rPr>
-        <w:t>MongoDB</w:t>
-      </w:r>
-      <w:proofErr w:type="spellEnd"/>
-      <w:r>
-        <w:rPr>
-          <w:rFonts w:ascii="Arial" w:hAnsi="Arial" w:cs="Arial"/>
-          <w:sz w:val="28"/>
-          <w:szCs w:val="28"/>
-        </w:rPr>
-        <w:t xml:space="preserve">, Express, </w:t>
-      </w:r>
-      <w:proofErr w:type="spellStart"/>
-      <w:r>
-        <w:rPr>
-          <w:rFonts w:ascii="Arial" w:hAnsi="Arial" w:cs="Arial"/>
-          <w:sz w:val="28"/>
-          <w:szCs w:val="28"/>
-        </w:rPr>
-        <w:t>React</w:t>
-      </w:r>
-      <w:proofErr w:type="spellEnd"/>
-      <w:r>
-        <w:rPr>
-          <w:rFonts w:ascii="Arial" w:hAnsi="Arial" w:cs="Arial"/>
-          <w:sz w:val="28"/>
-          <w:szCs w:val="28"/>
-        </w:rPr>
-        <w:t xml:space="preserve">, </w:t>
-      </w:r>
-      <w:proofErr w:type="spellStart"/>
-      <w:r>
-        <w:rPr>
-          <w:rFonts w:ascii="Arial" w:hAnsi="Arial" w:cs="Arial"/>
-          <w:sz w:val="28"/>
-          <w:szCs w:val="28"/>
-        </w:rPr>
-        <w:t>NodeJS</w:t>
-      </w:r>
-      <w:proofErr w:type="spellEnd"/>
-      <w:r>
-        <w:rPr>
-          <w:rFonts w:ascii="Arial" w:hAnsi="Arial" w:cs="Arial"/>
-          <w:sz w:val="28"/>
-          <w:szCs w:val="28"/>
-        </w:rPr>
-        <w:t>)</w:t>
+        <w:t>MERN (MongoDB, Express, React, NodeJS)</w:t>
       </w:r>
     </w:p>
     <w:p>
@@ -3427,34 +2903,14 @@
           <w:szCs w:val="28"/>
         </w:rPr>
       </w:pPr>
-      <w:proofErr w:type="spellStart"/>
-      <w:r>
-        <w:rPr>
-          <w:rFonts w:ascii="Arial" w:hAnsi="Arial" w:cs="Arial"/>
-          <w:sz w:val="28"/>
-          <w:szCs w:val="28"/>
-        </w:rPr>
-        <w:t>React</w:t>
-      </w:r>
-      <w:proofErr w:type="spellEnd"/>
-      <w:r>
-        <w:rPr>
-          <w:rFonts w:ascii="Arial" w:hAnsi="Arial" w:cs="Arial"/>
-          <w:sz w:val="28"/>
-          <w:szCs w:val="28"/>
-        </w:rPr>
-        <w:t xml:space="preserve"> </w:t>
-      </w:r>
-      <w:proofErr w:type="spellStart"/>
-      <w:r>
-        <w:rPr>
-          <w:rFonts w:ascii="Arial" w:hAnsi="Arial" w:cs="Arial"/>
-          <w:sz w:val="28"/>
-          <w:szCs w:val="28"/>
-        </w:rPr>
-        <w:t>Native</w:t>
-      </w:r>
-      <w:proofErr w:type="spellEnd"/>
+      <w:r>
+        <w:rPr>
+          <w:rFonts w:ascii="Arial" w:hAnsi="Arial" w:cs="Arial"/>
+          <w:sz w:val="28"/>
+          <w:szCs w:val="28"/>
+        </w:rPr>
+        <w:t>React Native</w:t>
+      </w:r>
       <w:r>
         <w:rPr>
           <w:rFonts w:ascii="Arial" w:hAnsi="Arial" w:cs="Arial"/>
@@ -3477,7 +2933,6 @@
           <w:szCs w:val="28"/>
         </w:rPr>
       </w:pPr>
-      <w:proofErr w:type="spellStart"/>
       <w:r>
         <w:rPr>
           <w:rFonts w:ascii="Arial" w:hAnsi="Arial" w:cs="Arial"/>
@@ -3486,7 +2941,6 @@
         </w:rPr>
         <w:t>Docker</w:t>
       </w:r>
-      <w:proofErr w:type="spellEnd"/>
     </w:p>
     <w:p>
       <w:pPr>
@@ -3501,7 +2955,6 @@
           <w:szCs w:val="28"/>
         </w:rPr>
       </w:pPr>
-      <w:proofErr w:type="spellStart"/>
       <w:r>
         <w:rPr>
           <w:rFonts w:ascii="Arial" w:hAnsi="Arial" w:cs="Arial"/>
@@ -3526,7 +2979,6 @@
         </w:rPr>
         <w:t>ub</w:t>
       </w:r>
-      <w:proofErr w:type="spellEnd"/>
     </w:p>
     <w:p>
       <w:pPr>
@@ -3541,7 +2993,6 @@
           <w:szCs w:val="28"/>
         </w:rPr>
       </w:pPr>
-      <w:proofErr w:type="spellStart"/>
       <w:r>
         <w:rPr>
           <w:rFonts w:ascii="Arial" w:hAnsi="Arial" w:cs="Arial"/>
@@ -3550,7 +3001,6 @@
         </w:rPr>
         <w:t>Discord</w:t>
       </w:r>
-      <w:proofErr w:type="spellEnd"/>
     </w:p>
     <w:p>
       <w:pPr>
@@ -3565,7 +3015,6 @@
           <w:szCs w:val="28"/>
         </w:rPr>
       </w:pPr>
-      <w:proofErr w:type="spellStart"/>
       <w:r>
         <w:rPr>
           <w:rFonts w:ascii="Arial" w:hAnsi="Arial" w:cs="Arial"/>
@@ -3574,7 +3023,6 @@
         </w:rPr>
         <w:t>Figma</w:t>
       </w:r>
-      <w:proofErr w:type="spellEnd"/>
     </w:p>
     <w:p>
       <w:pPr>
@@ -3589,34 +3037,14 @@
           <w:szCs w:val="28"/>
         </w:rPr>
       </w:pPr>
-      <w:proofErr w:type="spellStart"/>
-      <w:r>
-        <w:rPr>
-          <w:rFonts w:ascii="Arial" w:hAnsi="Arial" w:cs="Arial"/>
-          <w:sz w:val="28"/>
-          <w:szCs w:val="28"/>
-        </w:rPr>
-        <w:t>Visual</w:t>
-      </w:r>
-      <w:proofErr w:type="spellEnd"/>
-      <w:r>
-        <w:rPr>
-          <w:rFonts w:ascii="Arial" w:hAnsi="Arial" w:cs="Arial"/>
-          <w:sz w:val="28"/>
-          <w:szCs w:val="28"/>
-        </w:rPr>
-        <w:t xml:space="preserve"> Studio </w:t>
-      </w:r>
-      <w:proofErr w:type="spellStart"/>
-      <w:r>
-        <w:rPr>
-          <w:rFonts w:ascii="Arial" w:hAnsi="Arial" w:cs="Arial"/>
-          <w:sz w:val="28"/>
-          <w:szCs w:val="28"/>
-        </w:rPr>
-        <w:t>Code</w:t>
-      </w:r>
-      <w:proofErr w:type="spellEnd"/>
+      <w:r>
+        <w:rPr>
+          <w:rFonts w:ascii="Arial" w:hAnsi="Arial" w:cs="Arial"/>
+          <w:sz w:val="28"/>
+          <w:szCs w:val="28"/>
+        </w:rPr>
+        <w:t>Visual Studio Code</w:t>
+      </w:r>
     </w:p>
     <w:p>
       <w:pPr>
@@ -3631,7 +3059,6 @@
           <w:szCs w:val="28"/>
         </w:rPr>
       </w:pPr>
-      <w:proofErr w:type="spellStart"/>
       <w:r>
         <w:rPr>
           <w:rFonts w:ascii="Arial" w:hAnsi="Arial" w:cs="Arial"/>
@@ -3640,7 +3067,6 @@
         </w:rPr>
         <w:t>Jira</w:t>
       </w:r>
-      <w:proofErr w:type="spellEnd"/>
     </w:p>
     <w:p>
       <w:pPr>
@@ -3655,23 +3081,13 @@
           <w:szCs w:val="28"/>
         </w:rPr>
       </w:pPr>
-      <w:proofErr w:type="spellStart"/>
-      <w:r>
-        <w:rPr>
-          <w:rFonts w:ascii="Arial" w:hAnsi="Arial" w:cs="Arial"/>
-          <w:sz w:val="28"/>
-          <w:szCs w:val="28"/>
-        </w:rPr>
-        <w:t>ChatGPT</w:t>
-      </w:r>
-      <w:proofErr w:type="spellEnd"/>
-      <w:r>
-        <w:rPr>
-          <w:rFonts w:ascii="Arial" w:hAnsi="Arial" w:cs="Arial"/>
-          <w:sz w:val="28"/>
-          <w:szCs w:val="28"/>
-        </w:rPr>
-        <w:t xml:space="preserve"> API</w:t>
+      <w:r>
+        <w:rPr>
+          <w:rFonts w:ascii="Arial" w:hAnsi="Arial" w:cs="Arial"/>
+          <w:sz w:val="28"/>
+          <w:szCs w:val="28"/>
+        </w:rPr>
+        <w:t>ChatGPT API</w:t>
       </w:r>
     </w:p>
     <w:p>
@@ -3732,25 +3148,7 @@
           <w:sz w:val="28"/>
           <w:szCs w:val="28"/>
         </w:rPr>
-        <w:t xml:space="preserve"> (</w:t>
-      </w:r>
-      <w:proofErr w:type="spellStart"/>
-      <w:r>
-        <w:rPr>
-          <w:rFonts w:ascii="Arial" w:hAnsi="Arial" w:cs="Arial"/>
-          <w:sz w:val="28"/>
-          <w:szCs w:val="28"/>
-        </w:rPr>
-        <w:t>pedometer</w:t>
-      </w:r>
-      <w:proofErr w:type="spellEnd"/>
-      <w:r>
-        <w:rPr>
-          <w:rFonts w:ascii="Arial" w:hAnsi="Arial" w:cs="Arial"/>
-          <w:sz w:val="28"/>
-          <w:szCs w:val="28"/>
-        </w:rPr>
-        <w:t>)</w:t>
+        <w:t xml:space="preserve"> (pedometer)</w:t>
       </w:r>
     </w:p>
     <w:p>
@@ -3864,25 +3262,7 @@
           <w:sz w:val="28"/>
           <w:szCs w:val="28"/>
         </w:rPr>
-        <w:t>(</w:t>
-      </w:r>
-      <w:proofErr w:type="spellStart"/>
-      <w:r>
-        <w:rPr>
-          <w:rFonts w:ascii="Arial" w:hAnsi="Arial" w:cs="Arial"/>
-          <w:sz w:val="28"/>
-          <w:szCs w:val="28"/>
-        </w:rPr>
-        <w:t>Kaggle</w:t>
-      </w:r>
-      <w:proofErr w:type="spellEnd"/>
-      <w:r>
-        <w:rPr>
-          <w:rFonts w:ascii="Arial" w:hAnsi="Arial" w:cs="Arial"/>
-          <w:sz w:val="28"/>
-          <w:szCs w:val="28"/>
-        </w:rPr>
-        <w:t>)</w:t>
+        <w:t>(Kaggle)</w:t>
       </w:r>
     </w:p>
     <w:p>
@@ -3943,51 +3323,15 @@
           <w:sz w:val="28"/>
           <w:szCs w:val="28"/>
         </w:rPr>
-        <w:t xml:space="preserve">. Te podatke bomo posredoval </w:t>
-      </w:r>
-      <w:proofErr w:type="spellStart"/>
-      <w:r>
-        <w:rPr>
-          <w:rFonts w:ascii="Arial" w:hAnsi="Arial" w:cs="Arial"/>
-          <w:sz w:val="28"/>
-          <w:szCs w:val="28"/>
-        </w:rPr>
-        <w:t>ChatGPT</w:t>
-      </w:r>
-      <w:proofErr w:type="spellEnd"/>
-      <w:r>
-        <w:rPr>
-          <w:rFonts w:ascii="Arial" w:hAnsi="Arial" w:cs="Arial"/>
-          <w:sz w:val="28"/>
-          <w:szCs w:val="28"/>
-        </w:rPr>
-        <w:t xml:space="preserve"> API</w:t>
-      </w:r>
-      <w:r>
-        <w:rPr>
-          <w:rFonts w:ascii="Arial" w:hAnsi="Arial" w:cs="Arial"/>
-          <w:sz w:val="28"/>
-          <w:szCs w:val="28"/>
-        </w:rPr>
-        <w:t>, kateri nam bo vrnil izračunane '</w:t>
-      </w:r>
-      <w:proofErr w:type="spellStart"/>
-      <w:r>
-        <w:rPr>
-          <w:rFonts w:ascii="Arial" w:hAnsi="Arial" w:cs="Arial"/>
-          <w:sz w:val="28"/>
-          <w:szCs w:val="28"/>
-        </w:rPr>
-        <w:t>score</w:t>
-      </w:r>
-      <w:proofErr w:type="spellEnd"/>
-      <w:r>
-        <w:rPr>
-          <w:rFonts w:ascii="Arial" w:hAnsi="Arial" w:cs="Arial"/>
-          <w:sz w:val="28"/>
-          <w:szCs w:val="28"/>
-        </w:rPr>
-        <w:t>'</w:t>
+        <w:t>. Te podatke bomo posredoval ChatGPT API</w:t>
+      </w:r>
+      <w:r>
+        <w:rPr>
+          <w:rFonts w:ascii="Arial" w:hAnsi="Arial" w:cs="Arial"/>
+          <w:sz w:val="28"/>
+          <w:szCs w:val="28"/>
+        </w:rPr>
+        <w:t>, kateri nam bo vrnil izračunane 'score'</w:t>
       </w:r>
       <w:r>
         <w:rPr>
@@ -4011,25 +3355,7 @@
           <w:sz w:val="28"/>
           <w:szCs w:val="28"/>
         </w:rPr>
-        <w:t>Nato bomo na podlagi teh '</w:t>
-      </w:r>
-      <w:proofErr w:type="spellStart"/>
-      <w:r>
-        <w:rPr>
-          <w:rFonts w:ascii="Arial" w:hAnsi="Arial" w:cs="Arial"/>
-          <w:sz w:val="28"/>
-          <w:szCs w:val="28"/>
-        </w:rPr>
-        <w:t>scorov</w:t>
-      </w:r>
-      <w:proofErr w:type="spellEnd"/>
-      <w:r>
-        <w:rPr>
-          <w:rFonts w:ascii="Arial" w:hAnsi="Arial" w:cs="Arial"/>
-          <w:sz w:val="28"/>
-          <w:szCs w:val="28"/>
-        </w:rPr>
-        <w:t>'</w:t>
+        <w:t>Nato bomo na podlagi teh 'scorov'</w:t>
       </w:r>
       <w:r>
         <w:rPr>
@@ -4110,18 +3436,259 @@
           <w:sz w:val="28"/>
           <w:szCs w:val="28"/>
         </w:rPr>
-        <w:t>Njegov '</w:t>
-      </w:r>
-      <w:proofErr w:type="spellStart"/>
-      <w:r>
-        <w:rPr>
-          <w:rFonts w:ascii="Arial" w:hAnsi="Arial" w:cs="Arial"/>
-          <w:sz w:val="28"/>
-          <w:szCs w:val="28"/>
-        </w:rPr>
-        <w:t>sleep</w:t>
-      </w:r>
-      <w:proofErr w:type="spellEnd"/>
+        <w:t>Njegov 'sleep score' je 60/100</w:t>
+      </w:r>
+      <w:r>
+        <w:rPr>
+          <w:rFonts w:ascii="Arial" w:hAnsi="Arial" w:cs="Arial"/>
+          <w:sz w:val="28"/>
+          <w:szCs w:val="28"/>
+        </w:rPr>
+        <w:t>, ker gre spat okoli 23:00</w:t>
+      </w:r>
+      <w:r>
+        <w:rPr>
+          <w:rFonts w:ascii="Arial" w:hAnsi="Arial" w:cs="Arial"/>
+          <w:sz w:val="28"/>
+          <w:szCs w:val="28"/>
+        </w:rPr>
+        <w:t xml:space="preserve"> in se zbuja ob 6:00</w:t>
+      </w:r>
+      <w:r>
+        <w:rPr>
+          <w:rFonts w:ascii="Arial" w:hAnsi="Arial" w:cs="Arial"/>
+          <w:sz w:val="28"/>
+          <w:szCs w:val="28"/>
+        </w:rPr>
+        <w:t>.</w:t>
+      </w:r>
+      <w:r>
+        <w:rPr>
+          <w:rFonts w:ascii="Arial" w:hAnsi="Arial" w:cs="Arial"/>
+          <w:sz w:val="28"/>
+          <w:szCs w:val="28"/>
+        </w:rPr>
+        <w:t xml:space="preserve"> Pred spanjem</w:t>
+      </w:r>
+      <w:r>
+        <w:rPr>
+          <w:rFonts w:ascii="Arial" w:hAnsi="Arial" w:cs="Arial"/>
+          <w:sz w:val="28"/>
+          <w:szCs w:val="28"/>
+        </w:rPr>
+        <w:t xml:space="preserve"> pa je aktivnost na telefonu okoli 2h</w:t>
+      </w:r>
+      <w:r>
+        <w:rPr>
+          <w:rFonts w:ascii="Arial" w:hAnsi="Arial" w:cs="Arial"/>
+          <w:sz w:val="28"/>
+          <w:szCs w:val="28"/>
+        </w:rPr>
+        <w:t xml:space="preserve"> -&gt; </w:t>
+      </w:r>
+      <w:r>
+        <w:rPr>
+          <w:rFonts w:ascii="Arial" w:hAnsi="Arial" w:cs="Arial"/>
+          <w:sz w:val="28"/>
+          <w:szCs w:val="28"/>
+        </w:rPr>
+        <w:t>Iz medicinskega članka/člankov (povezava – link)</w:t>
+      </w:r>
+      <w:r>
+        <w:rPr>
+          <w:rFonts w:ascii="Arial" w:hAnsi="Arial" w:cs="Arial"/>
+          <w:sz w:val="28"/>
+          <w:szCs w:val="28"/>
+        </w:rPr>
+        <w:t xml:space="preserve"> je razvidno, da se priporoča </w:t>
+      </w:r>
+      <w:r>
+        <w:rPr>
+          <w:rFonts w:ascii="Arial" w:hAnsi="Arial" w:cs="Arial"/>
+          <w:sz w:val="28"/>
+          <w:szCs w:val="28"/>
+        </w:rPr>
+        <w:t>vsaj 7-8h spanja na dan, zato je priporočeno, da gre spat okoli 22:00</w:t>
+      </w:r>
+      <w:r>
+        <w:rPr>
+          <w:rFonts w:ascii="Arial" w:hAnsi="Arial" w:cs="Arial"/>
+          <w:sz w:val="28"/>
+          <w:szCs w:val="28"/>
+        </w:rPr>
+        <w:t xml:space="preserve"> in da vsaj pol ure pred spanjem ni na telefonu, če pa je, pa mora biti manj časa</w:t>
+      </w:r>
+      <w:r>
+        <w:rPr>
+          <w:rFonts w:ascii="Arial" w:hAnsi="Arial" w:cs="Arial"/>
+          <w:sz w:val="28"/>
+          <w:szCs w:val="28"/>
+        </w:rPr>
+        <w:t xml:space="preserve"> skupaj</w:t>
+      </w:r>
+      <w:r>
+        <w:rPr>
+          <w:rFonts w:ascii="Arial" w:hAnsi="Arial" w:cs="Arial"/>
+          <w:sz w:val="28"/>
+          <w:szCs w:val="28"/>
+        </w:rPr>
+        <w:t xml:space="preserve"> (</w:t>
+      </w:r>
+      <w:r>
+        <w:rPr>
+          <w:rFonts w:ascii="Arial" w:hAnsi="Arial" w:cs="Arial"/>
+          <w:sz w:val="28"/>
+          <w:szCs w:val="28"/>
+        </w:rPr>
+        <w:t>to bo vrnil ChatGPT API)</w:t>
+      </w:r>
+      <w:r>
+        <w:rPr>
+          <w:rFonts w:ascii="Arial" w:hAnsi="Arial" w:cs="Arial"/>
+          <w:sz w:val="28"/>
+          <w:szCs w:val="28"/>
+        </w:rPr>
+        <w:t xml:space="preserve"> -&gt; Uporabniku se bo to prikazal kot predlog za izboljšavo mentalnega zdravja</w:t>
+      </w:r>
+      <w:r>
+        <w:rPr>
+          <w:rFonts w:ascii="Arial" w:hAnsi="Arial" w:cs="Arial"/>
+          <w:sz w:val="28"/>
+          <w:szCs w:val="28"/>
+        </w:rPr>
+        <w:t>, ker naj bi dovolj spanca vplivalo pozitivno na osebo</w:t>
+      </w:r>
+      <w:r>
+        <w:rPr>
+          <w:rFonts w:ascii="Arial" w:hAnsi="Arial" w:cs="Arial"/>
+          <w:sz w:val="28"/>
+          <w:szCs w:val="28"/>
+        </w:rPr>
+        <w:t>.</w:t>
+      </w:r>
+    </w:p>
+    <w:p>
+      <w:pPr>
+        <w:pStyle w:val="Odstavekseznama"/>
+        <w:numPr>
+          <w:ilvl w:val="0"/>
+          <w:numId w:val="1"/>
+        </w:numPr>
+        <w:rPr>
+          <w:rFonts w:ascii="Arial" w:hAnsi="Arial" w:cs="Arial"/>
+          <w:sz w:val="28"/>
+          <w:szCs w:val="28"/>
+        </w:rPr>
+      </w:pPr>
+      <w:r>
+        <w:rPr>
+          <w:rFonts w:ascii="Arial" w:hAnsi="Arial" w:cs="Arial"/>
+          <w:sz w:val="28"/>
+          <w:szCs w:val="28"/>
+        </w:rPr>
+        <w:t>Predlogi morajo biti realno izvedljivi</w:t>
+      </w:r>
+      <w:r>
+        <w:rPr>
+          <w:rFonts w:ascii="Arial" w:hAnsi="Arial" w:cs="Arial"/>
+          <w:sz w:val="28"/>
+          <w:szCs w:val="28"/>
+        </w:rPr>
+        <w:t xml:space="preserve"> in ne smejo drastično spreminjati uporabnikovega življenjskega sloga, ampak ga morajo postopoma in počasi spreminjati</w:t>
+      </w:r>
+      <w:r>
+        <w:rPr>
+          <w:rFonts w:ascii="Arial" w:hAnsi="Arial" w:cs="Arial"/>
+          <w:sz w:val="28"/>
+          <w:szCs w:val="28"/>
+        </w:rPr>
+        <w:t xml:space="preserve"> (nova stran -&gt; če se predlog upošteva (nekaj tednov/dni)</w:t>
+      </w:r>
+      <w:r>
+        <w:rPr>
+          <w:rFonts w:ascii="Arial" w:hAnsi="Arial" w:cs="Arial"/>
+          <w:sz w:val="28"/>
+          <w:szCs w:val="28"/>
+        </w:rPr>
+        <w:t xml:space="preserve">, lahko uporabnik dobi </w:t>
+      </w:r>
+      <w:r>
+        <w:rPr>
+          <w:rFonts w:ascii="Arial" w:hAnsi="Arial" w:cs="Arial"/>
+          <w:sz w:val="28"/>
+          <w:szCs w:val="28"/>
+        </w:rPr>
+        <w:t>novo značko</w:t>
+      </w:r>
+      <w:r>
+        <w:rPr>
+          <w:rFonts w:ascii="Arial" w:hAnsi="Arial" w:cs="Arial"/>
+          <w:sz w:val="28"/>
+          <w:szCs w:val="28"/>
+        </w:rPr>
+        <w:t>)</w:t>
+      </w:r>
+      <w:r>
+        <w:rPr>
+          <w:rFonts w:ascii="Arial" w:hAnsi="Arial" w:cs="Arial"/>
+          <w:sz w:val="28"/>
+          <w:szCs w:val="28"/>
+        </w:rPr>
+        <w:t>.</w:t>
+      </w:r>
+    </w:p>
+    <w:p>
+      <w:pPr>
+        <w:rPr>
+          <w:rFonts w:ascii="Arial" w:hAnsi="Arial" w:cs="Arial"/>
+          <w:b/>
+          <w:bCs/>
+          <w:sz w:val="28"/>
+          <w:szCs w:val="28"/>
+        </w:rPr>
+      </w:pPr>
+      <w:r>
+        <w:rPr>
+          <w:rFonts w:ascii="Arial" w:hAnsi="Arial" w:cs="Arial"/>
+          <w:b/>
+          <w:bCs/>
+          <w:sz w:val="28"/>
+          <w:szCs w:val="28"/>
+        </w:rPr>
+        <w:t>Delo po posameznikih</w:t>
+      </w:r>
+      <w:r>
+        <w:rPr>
+          <w:rFonts w:ascii="Arial" w:hAnsi="Arial" w:cs="Arial"/>
+          <w:b/>
+          <w:bCs/>
+          <w:sz w:val="28"/>
+          <w:szCs w:val="28"/>
+        </w:rPr>
+        <w:t>:</w:t>
+      </w:r>
+    </w:p>
+    <w:p>
+      <w:pPr>
+        <w:pStyle w:val="Odstavekseznama"/>
+        <w:numPr>
+          <w:ilvl w:val="0"/>
+          <w:numId w:val="1"/>
+        </w:numPr>
+        <w:rPr>
+          <w:rFonts w:ascii="Arial" w:hAnsi="Arial" w:cs="Arial"/>
+          <w:sz w:val="28"/>
+          <w:szCs w:val="28"/>
+        </w:rPr>
+      </w:pPr>
+      <w:r>
+        <w:rPr>
+          <w:rFonts w:ascii="Arial" w:hAnsi="Arial" w:cs="Arial"/>
+          <w:sz w:val="28"/>
+          <w:szCs w:val="28"/>
+        </w:rPr>
+        <w:t>Enej Vodušek</w:t>
+      </w:r>
       <w:r>
         <w:rPr>
           <w:rFonts w:ascii="Arial" w:hAnsi="Arial" w:cs="Arial"/>
@@ -4130,169 +3697,165 @@
         </w:rPr>
         <w:t xml:space="preserve"> </w:t>
       </w:r>
-      <w:proofErr w:type="spellStart"/>
-      <w:r>
-        <w:rPr>
-          <w:rFonts w:ascii="Arial" w:hAnsi="Arial" w:cs="Arial"/>
-          <w:sz w:val="28"/>
-          <w:szCs w:val="28"/>
-        </w:rPr>
-        <w:t>score</w:t>
-      </w:r>
-      <w:proofErr w:type="spellEnd"/>
-      <w:r>
-        <w:rPr>
-          <w:rFonts w:ascii="Arial" w:hAnsi="Arial" w:cs="Arial"/>
-          <w:sz w:val="28"/>
-          <w:szCs w:val="28"/>
-        </w:rPr>
-        <w:t>' je 60/100</w:t>
-      </w:r>
-      <w:r>
-        <w:rPr>
-          <w:rFonts w:ascii="Arial" w:hAnsi="Arial" w:cs="Arial"/>
-          <w:sz w:val="28"/>
-          <w:szCs w:val="28"/>
-        </w:rPr>
-        <w:t>, ker gre spat okoli 23:00</w:t>
-      </w:r>
-      <w:r>
-        <w:rPr>
-          <w:rFonts w:ascii="Arial" w:hAnsi="Arial" w:cs="Arial"/>
-          <w:sz w:val="28"/>
-          <w:szCs w:val="28"/>
-        </w:rPr>
-        <w:t xml:space="preserve"> in se zbuja ob 6:00</w:t>
-      </w:r>
-      <w:r>
-        <w:rPr>
-          <w:rFonts w:ascii="Arial" w:hAnsi="Arial" w:cs="Arial"/>
-          <w:sz w:val="28"/>
-          <w:szCs w:val="28"/>
-        </w:rPr>
-        <w:t>.</w:t>
-      </w:r>
-      <w:r>
-        <w:rPr>
-          <w:rFonts w:ascii="Arial" w:hAnsi="Arial" w:cs="Arial"/>
-          <w:sz w:val="28"/>
-          <w:szCs w:val="28"/>
-        </w:rPr>
-        <w:t xml:space="preserve"> Pred spanjem</w:t>
-      </w:r>
-      <w:r>
-        <w:rPr>
-          <w:rFonts w:ascii="Arial" w:hAnsi="Arial" w:cs="Arial"/>
-          <w:sz w:val="28"/>
-          <w:szCs w:val="28"/>
-        </w:rPr>
-        <w:t xml:space="preserve"> pa je aktivnost na telefonu okoli 2h</w:t>
-      </w:r>
-      <w:r>
-        <w:rPr>
-          <w:rFonts w:ascii="Arial" w:hAnsi="Arial" w:cs="Arial"/>
-          <w:sz w:val="28"/>
-          <w:szCs w:val="28"/>
-        </w:rPr>
-        <w:t xml:space="preserve"> -&gt; </w:t>
-      </w:r>
-      <w:r>
-        <w:rPr>
-          <w:rFonts w:ascii="Arial" w:hAnsi="Arial" w:cs="Arial"/>
-          <w:sz w:val="28"/>
-          <w:szCs w:val="28"/>
-        </w:rPr>
-        <w:t>Iz medicinskega članka/člankov (povezava – link)</w:t>
-      </w:r>
-      <w:r>
-        <w:rPr>
-          <w:rFonts w:ascii="Arial" w:hAnsi="Arial" w:cs="Arial"/>
-          <w:sz w:val="28"/>
-          <w:szCs w:val="28"/>
-        </w:rPr>
-        <w:t xml:space="preserve"> je razvidno, da se priporoča </w:t>
-      </w:r>
-      <w:r>
-        <w:rPr>
-          <w:rFonts w:ascii="Arial" w:hAnsi="Arial" w:cs="Arial"/>
-          <w:sz w:val="28"/>
-          <w:szCs w:val="28"/>
-        </w:rPr>
-        <w:t>vsaj 7-8h spanja na dan, zato je priporočeno, da gre spat okoli 22:00</w:t>
-      </w:r>
-      <w:r>
-        <w:rPr>
-          <w:rFonts w:ascii="Arial" w:hAnsi="Arial" w:cs="Arial"/>
-          <w:sz w:val="28"/>
-          <w:szCs w:val="28"/>
-        </w:rPr>
-        <w:t xml:space="preserve"> in da vsaj pol ure pred spanjem ni na telefonu, če pa je, pa mora biti manj časa</w:t>
-      </w:r>
-      <w:r>
-        <w:rPr>
-          <w:rFonts w:ascii="Arial" w:hAnsi="Arial" w:cs="Arial"/>
-          <w:sz w:val="28"/>
-          <w:szCs w:val="28"/>
-        </w:rPr>
-        <w:t xml:space="preserve"> skupaj</w:t>
-      </w:r>
-      <w:r>
-        <w:rPr>
-          <w:rFonts w:ascii="Arial" w:hAnsi="Arial" w:cs="Arial"/>
-          <w:sz w:val="28"/>
-          <w:szCs w:val="28"/>
-        </w:rPr>
-        <w:t xml:space="preserve"> (</w:t>
-      </w:r>
-      <w:r>
-        <w:rPr>
-          <w:rFonts w:ascii="Arial" w:hAnsi="Arial" w:cs="Arial"/>
-          <w:sz w:val="28"/>
-          <w:szCs w:val="28"/>
-        </w:rPr>
-        <w:t xml:space="preserve">to bo vrnil </w:t>
-      </w:r>
-      <w:proofErr w:type="spellStart"/>
-      <w:r>
-        <w:rPr>
-          <w:rFonts w:ascii="Arial" w:hAnsi="Arial" w:cs="Arial"/>
-          <w:sz w:val="28"/>
-          <w:szCs w:val="28"/>
-        </w:rPr>
-        <w:t>ChatGPT</w:t>
-      </w:r>
-      <w:proofErr w:type="spellEnd"/>
-      <w:r>
-        <w:rPr>
-          <w:rFonts w:ascii="Arial" w:hAnsi="Arial" w:cs="Arial"/>
-          <w:sz w:val="28"/>
-          <w:szCs w:val="28"/>
-        </w:rPr>
-        <w:t xml:space="preserve"> API)</w:t>
-      </w:r>
-      <w:r>
-        <w:rPr>
-          <w:rFonts w:ascii="Arial" w:hAnsi="Arial" w:cs="Arial"/>
-          <w:sz w:val="28"/>
-          <w:szCs w:val="28"/>
-        </w:rPr>
-        <w:t xml:space="preserve"> -&gt; Uporabniku se bo to prikazal kot predlog za izboljšavo mentalnega zdravja</w:t>
-      </w:r>
-      <w:r>
-        <w:rPr>
-          <w:rFonts w:ascii="Arial" w:hAnsi="Arial" w:cs="Arial"/>
-          <w:sz w:val="28"/>
-          <w:szCs w:val="28"/>
-        </w:rPr>
-        <w:t>, ker naj bi dovolj spanca vplivalo pozitivno na osebo</w:t>
-      </w:r>
-      <w:r>
-        <w:rPr>
-          <w:rFonts w:ascii="Arial" w:hAnsi="Arial" w:cs="Arial"/>
-          <w:sz w:val="28"/>
-          <w:szCs w:val="28"/>
-        </w:rPr>
-        <w:t>.</w:t>
+      <w:r>
+        <w:rPr>
+          <w:rFonts w:ascii="Arial" w:hAnsi="Arial" w:cs="Arial"/>
+          <w:sz w:val="28"/>
+          <w:szCs w:val="28"/>
+        </w:rPr>
+        <w:t>–</w:t>
+      </w:r>
+      <w:r>
+        <w:rPr>
+          <w:rFonts w:ascii="Arial" w:hAnsi="Arial" w:cs="Arial"/>
+          <w:sz w:val="28"/>
+          <w:szCs w:val="28"/>
+        </w:rPr>
+        <w:t xml:space="preserve"> </w:t>
+      </w:r>
+      <w:r>
+        <w:rPr>
+          <w:rFonts w:ascii="Arial" w:hAnsi="Arial" w:cs="Arial"/>
+          <w:sz w:val="28"/>
+          <w:szCs w:val="28"/>
+        </w:rPr>
+        <w:t xml:space="preserve">(RAIN: </w:t>
+      </w:r>
+      <w:r>
+        <w:rPr>
+          <w:rFonts w:ascii="Arial" w:hAnsi="Arial" w:cs="Arial"/>
+          <w:sz w:val="28"/>
+          <w:szCs w:val="28"/>
+        </w:rPr>
+        <w:t>Poročila + pomoč pri backendu</w:t>
+      </w:r>
+      <w:r>
+        <w:rPr>
+          <w:rFonts w:ascii="Arial" w:hAnsi="Arial" w:cs="Arial"/>
+          <w:sz w:val="28"/>
+          <w:szCs w:val="28"/>
+        </w:rPr>
+        <w:t xml:space="preserve"> in frontendu</w:t>
+      </w:r>
+      <w:r>
+        <w:rPr>
+          <w:rFonts w:ascii="Arial" w:hAnsi="Arial" w:cs="Arial"/>
+          <w:sz w:val="28"/>
+          <w:szCs w:val="28"/>
+        </w:rPr>
+        <w:t>, ORV: ???, NPO: ???</w:t>
+      </w:r>
+      <w:r>
+        <w:rPr>
+          <w:rFonts w:ascii="Arial" w:hAnsi="Arial" w:cs="Arial"/>
+          <w:sz w:val="28"/>
+          <w:szCs w:val="28"/>
+        </w:rPr>
+        <w:t xml:space="preserve">, SA: </w:t>
+      </w:r>
+      <w:r>
+        <w:rPr>
+          <w:rFonts w:ascii="Arial" w:hAnsi="Arial" w:cs="Arial"/>
+          <w:sz w:val="28"/>
+          <w:szCs w:val="28"/>
+        </w:rPr>
+        <w:t xml:space="preserve">Github, </w:t>
+      </w:r>
+      <w:r>
+        <w:rPr>
+          <w:rFonts w:ascii="Arial" w:hAnsi="Arial" w:cs="Arial"/>
+          <w:sz w:val="28"/>
+          <w:szCs w:val="28"/>
+        </w:rPr>
+        <w:t xml:space="preserve">Jira, </w:t>
+      </w:r>
+      <w:r>
+        <w:rPr>
+          <w:rFonts w:ascii="Arial" w:hAnsi="Arial" w:cs="Arial"/>
+          <w:sz w:val="28"/>
+          <w:szCs w:val="28"/>
+        </w:rPr>
+        <w:t xml:space="preserve">DockerHub, </w:t>
+      </w:r>
+      <w:r>
+        <w:rPr>
+          <w:rFonts w:ascii="Arial" w:hAnsi="Arial" w:cs="Arial"/>
+          <w:sz w:val="28"/>
+          <w:szCs w:val="28"/>
+        </w:rPr>
+        <w:t>Docker</w:t>
+      </w:r>
+      <w:r>
+        <w:rPr>
+          <w:rFonts w:ascii="Arial" w:hAnsi="Arial" w:cs="Arial"/>
+          <w:sz w:val="28"/>
+          <w:szCs w:val="28"/>
+        </w:rPr>
+        <w:t xml:space="preserve"> kontejnerji</w:t>
+      </w:r>
+      <w:r>
+        <w:rPr>
+          <w:rFonts w:ascii="Arial" w:hAnsi="Arial" w:cs="Arial"/>
+          <w:sz w:val="28"/>
+          <w:szCs w:val="28"/>
+        </w:rPr>
+        <w:t xml:space="preserve">, </w:t>
+      </w:r>
+      <w:r>
+        <w:rPr>
+          <w:rFonts w:ascii="Arial" w:hAnsi="Arial" w:cs="Arial"/>
+          <w:sz w:val="28"/>
+          <w:szCs w:val="28"/>
+        </w:rPr>
+        <w:t xml:space="preserve">test skripte, </w:t>
+      </w:r>
+      <w:r>
+        <w:rPr>
+          <w:rFonts w:ascii="Arial" w:hAnsi="Arial" w:cs="Arial"/>
+          <w:sz w:val="28"/>
+          <w:szCs w:val="28"/>
+        </w:rPr>
+        <w:t>poročila</w:t>
+      </w:r>
+      <w:r>
+        <w:rPr>
+          <w:rFonts w:ascii="Arial" w:hAnsi="Arial" w:cs="Arial"/>
+          <w:sz w:val="28"/>
+          <w:szCs w:val="28"/>
+        </w:rPr>
+        <w:t>, 2 PR</w:t>
+      </w:r>
+      <w:r>
+        <w:rPr>
+          <w:rFonts w:ascii="Arial" w:hAnsi="Arial" w:cs="Arial"/>
+          <w:sz w:val="28"/>
+          <w:szCs w:val="28"/>
+        </w:rPr>
+        <w:t xml:space="preserve"> + 60 c</w:t>
+      </w:r>
+      <w:r>
+        <w:rPr>
+          <w:rFonts w:ascii="Arial" w:hAnsi="Arial" w:cs="Arial"/>
+          <w:sz w:val="28"/>
+          <w:szCs w:val="28"/>
+        </w:rPr>
+        <w:t>o</w:t>
+      </w:r>
+      <w:r>
+        <w:rPr>
+          <w:rFonts w:ascii="Arial" w:hAnsi="Arial" w:cs="Arial"/>
+          <w:sz w:val="28"/>
+          <w:szCs w:val="28"/>
+        </w:rPr>
+        <w:t>mmitov</w:t>
+      </w:r>
+      <w:r>
+        <w:rPr>
+          <w:rFonts w:ascii="Arial" w:hAnsi="Arial" w:cs="Arial"/>
+          <w:sz w:val="28"/>
+          <w:szCs w:val="28"/>
+        </w:rPr>
+        <w:t>)</w:t>
       </w:r>
     </w:p>
     <w:p>
@@ -4314,39 +3877,135 @@
           <w:sz w:val="28"/>
           <w:szCs w:val="28"/>
         </w:rPr>
-        <w:t>Predlogi morajo biti realno izvedljivi</w:t>
-      </w:r>
-      <w:r>
-        <w:rPr>
-          <w:rFonts w:ascii="Arial" w:hAnsi="Arial" w:cs="Arial"/>
-          <w:sz w:val="28"/>
-          <w:szCs w:val="28"/>
-        </w:rPr>
-        <w:t xml:space="preserve"> in ne smejo drastično spreminjati uporabnikovega življenjskega sloga, ampak ga morajo postopoma in počasi spreminjati</w:t>
-      </w:r>
-      <w:r>
-        <w:rPr>
-          <w:rFonts w:ascii="Arial" w:hAnsi="Arial" w:cs="Arial"/>
-          <w:sz w:val="28"/>
-          <w:szCs w:val="28"/>
-        </w:rPr>
-        <w:t xml:space="preserve"> (nova stran -&gt; če se predlog upošteva (nekaj tednov/dni)</w:t>
-      </w:r>
-      <w:r>
-        <w:rPr>
-          <w:rFonts w:ascii="Arial" w:hAnsi="Arial" w:cs="Arial"/>
-          <w:sz w:val="28"/>
-          <w:szCs w:val="28"/>
-        </w:rPr>
-        <w:t xml:space="preserve">, lahko uporabnik dobi </w:t>
-      </w:r>
-      <w:r>
-        <w:rPr>
-          <w:rFonts w:ascii="Arial" w:hAnsi="Arial" w:cs="Arial"/>
-          <w:sz w:val="28"/>
-          <w:szCs w:val="28"/>
-        </w:rPr>
-        <w:t>novo značko</w:t>
+        <w:t>Nik Mejak</w:t>
+      </w:r>
+      <w:r>
+        <w:rPr>
+          <w:rFonts w:ascii="Arial" w:hAnsi="Arial" w:cs="Arial"/>
+          <w:sz w:val="28"/>
+          <w:szCs w:val="28"/>
+        </w:rPr>
+        <w:t xml:space="preserve"> </w:t>
+      </w:r>
+      <w:r>
+        <w:rPr>
+          <w:rFonts w:ascii="Arial" w:hAnsi="Arial" w:cs="Arial"/>
+          <w:sz w:val="28"/>
+          <w:szCs w:val="28"/>
+        </w:rPr>
+        <w:t>–</w:t>
+      </w:r>
+      <w:r>
+        <w:rPr>
+          <w:rFonts w:ascii="Arial" w:hAnsi="Arial" w:cs="Arial"/>
+          <w:sz w:val="28"/>
+          <w:szCs w:val="28"/>
+        </w:rPr>
+        <w:t xml:space="preserve"> </w:t>
+      </w:r>
+      <w:r>
+        <w:rPr>
+          <w:rFonts w:ascii="Arial" w:hAnsi="Arial" w:cs="Arial"/>
+          <w:sz w:val="28"/>
+          <w:szCs w:val="28"/>
+        </w:rPr>
+        <w:t>(</w:t>
+      </w:r>
+      <w:r>
+        <w:rPr>
+          <w:rFonts w:ascii="Arial" w:hAnsi="Arial" w:cs="Arial"/>
+          <w:sz w:val="28"/>
+          <w:szCs w:val="28"/>
+        </w:rPr>
+        <w:t xml:space="preserve">RAIN: </w:t>
+      </w:r>
+      <w:r>
+        <w:rPr>
+          <w:rFonts w:ascii="Arial" w:hAnsi="Arial" w:cs="Arial"/>
+          <w:sz w:val="28"/>
+          <w:szCs w:val="28"/>
+        </w:rPr>
+        <w:t>celoten frontend</w:t>
+      </w:r>
+      <w:r>
+        <w:rPr>
+          <w:rFonts w:ascii="Arial" w:hAnsi="Arial" w:cs="Arial"/>
+          <w:sz w:val="28"/>
+          <w:szCs w:val="28"/>
+        </w:rPr>
+        <w:t xml:space="preserve"> + design</w:t>
+      </w:r>
+      <w:r>
+        <w:rPr>
+          <w:rFonts w:ascii="Arial" w:hAnsi="Arial" w:cs="Arial"/>
+          <w:sz w:val="28"/>
+          <w:szCs w:val="28"/>
+        </w:rPr>
+        <w:t>, ORV: ???, NPO: ???, SA:</w:t>
+      </w:r>
+      <w:r>
+        <w:rPr>
+          <w:rFonts w:ascii="Arial" w:hAnsi="Arial" w:cs="Arial"/>
+          <w:sz w:val="28"/>
+          <w:szCs w:val="28"/>
+        </w:rPr>
+        <w:t xml:space="preserve"> test skripte</w:t>
+      </w:r>
+      <w:r>
+        <w:rPr>
+          <w:rFonts w:ascii="Arial" w:hAnsi="Arial" w:cs="Arial"/>
+          <w:sz w:val="28"/>
+          <w:szCs w:val="28"/>
+        </w:rPr>
+        <w:t>, Docker kont</w:t>
+      </w:r>
+      <w:r>
+        <w:rPr>
+          <w:rFonts w:ascii="Arial" w:hAnsi="Arial" w:cs="Arial"/>
+          <w:sz w:val="28"/>
+          <w:szCs w:val="28"/>
+        </w:rPr>
+        <w:t>ej</w:t>
+      </w:r>
+      <w:r>
+        <w:rPr>
+          <w:rFonts w:ascii="Arial" w:hAnsi="Arial" w:cs="Arial"/>
+          <w:sz w:val="28"/>
+          <w:szCs w:val="28"/>
+        </w:rPr>
+        <w:t>nerji</w:t>
+      </w:r>
+      <w:r>
+        <w:rPr>
+          <w:rFonts w:ascii="Arial" w:hAnsi="Arial" w:cs="Arial"/>
+          <w:sz w:val="28"/>
+          <w:szCs w:val="28"/>
+        </w:rPr>
+        <w:t>, 2 PR</w:t>
+      </w:r>
+      <w:r>
+        <w:rPr>
+          <w:rFonts w:ascii="Arial" w:hAnsi="Arial" w:cs="Arial"/>
+          <w:sz w:val="28"/>
+          <w:szCs w:val="28"/>
+        </w:rPr>
+        <w:t xml:space="preserve"> + </w:t>
+      </w:r>
+      <w:r>
+        <w:rPr>
+          <w:rFonts w:ascii="Arial" w:hAnsi="Arial" w:cs="Arial"/>
+          <w:sz w:val="28"/>
+          <w:szCs w:val="28"/>
+        </w:rPr>
+        <w:t>6</w:t>
+      </w:r>
+      <w:r>
+        <w:rPr>
+          <w:rFonts w:ascii="Arial" w:hAnsi="Arial" w:cs="Arial"/>
+          <w:sz w:val="28"/>
+          <w:szCs w:val="28"/>
+        </w:rPr>
+        <w:t>0 commitov</w:t>
       </w:r>
       <w:r>
         <w:rPr>
@@ -4356,13 +4015,278 @@
         </w:rPr>
         <w:t>)</w:t>
       </w:r>
-      <w:r>
-        <w:rPr>
-          <w:rFonts w:ascii="Arial" w:hAnsi="Arial" w:cs="Arial"/>
-          <w:sz w:val="28"/>
-          <w:szCs w:val="28"/>
-        </w:rPr>
-        <w:t>.</w:t>
+    </w:p>
+    <w:p>
+      <w:pPr>
+        <w:pStyle w:val="Odstavekseznama"/>
+        <w:numPr>
+          <w:ilvl w:val="0"/>
+          <w:numId w:val="1"/>
+        </w:numPr>
+        <w:rPr>
+          <w:rFonts w:ascii="Arial" w:hAnsi="Arial" w:cs="Arial"/>
+          <w:sz w:val="28"/>
+          <w:szCs w:val="28"/>
+        </w:rPr>
+      </w:pPr>
+      <w:r>
+        <w:rPr>
+          <w:rFonts w:ascii="Arial" w:hAnsi="Arial" w:cs="Arial"/>
+          <w:sz w:val="28"/>
+          <w:szCs w:val="28"/>
+        </w:rPr>
+        <w:t>Žiga Berk Lebič</w:t>
+      </w:r>
+      <w:r>
+        <w:rPr>
+          <w:rFonts w:ascii="Arial" w:hAnsi="Arial" w:cs="Arial"/>
+          <w:sz w:val="28"/>
+          <w:szCs w:val="28"/>
+        </w:rPr>
+        <w:t xml:space="preserve"> – </w:t>
+      </w:r>
+      <w:r>
+        <w:rPr>
+          <w:rFonts w:ascii="Arial" w:hAnsi="Arial" w:cs="Arial"/>
+          <w:sz w:val="28"/>
+          <w:szCs w:val="28"/>
+        </w:rPr>
+        <w:t>(</w:t>
+      </w:r>
+      <w:r>
+        <w:rPr>
+          <w:rFonts w:ascii="Arial" w:hAnsi="Arial" w:cs="Arial"/>
+          <w:sz w:val="28"/>
+          <w:szCs w:val="28"/>
+        </w:rPr>
+        <w:t xml:space="preserve">RAIN: </w:t>
+      </w:r>
+      <w:r>
+        <w:rPr>
+          <w:rFonts w:ascii="Arial" w:hAnsi="Arial" w:cs="Arial"/>
+          <w:sz w:val="28"/>
+          <w:szCs w:val="28"/>
+        </w:rPr>
+        <w:t>celoten backend</w:t>
+      </w:r>
+      <w:r>
+        <w:rPr>
+          <w:rFonts w:ascii="Arial" w:hAnsi="Arial" w:cs="Arial"/>
+          <w:sz w:val="28"/>
+          <w:szCs w:val="28"/>
+        </w:rPr>
+        <w:t>, ORV: ???, NPO: ???, SA:</w:t>
+      </w:r>
+      <w:r>
+        <w:rPr>
+          <w:rFonts w:ascii="Arial" w:hAnsi="Arial" w:cs="Arial"/>
+          <w:sz w:val="28"/>
+          <w:szCs w:val="28"/>
+        </w:rPr>
+        <w:t xml:space="preserve"> test skripte, Docker kontejnerji</w:t>
+      </w:r>
+      <w:r>
+        <w:rPr>
+          <w:rFonts w:ascii="Arial" w:hAnsi="Arial" w:cs="Arial"/>
+          <w:sz w:val="28"/>
+          <w:szCs w:val="28"/>
+        </w:rPr>
+        <w:t>, 2</w:t>
+      </w:r>
+      <w:r>
+        <w:rPr>
+          <w:rFonts w:ascii="Arial" w:hAnsi="Arial" w:cs="Arial"/>
+          <w:sz w:val="28"/>
+          <w:szCs w:val="28"/>
+        </w:rPr>
+        <w:t xml:space="preserve"> </w:t>
+      </w:r>
+      <w:r>
+        <w:rPr>
+          <w:rFonts w:ascii="Arial" w:hAnsi="Arial" w:cs="Arial"/>
+          <w:sz w:val="28"/>
+          <w:szCs w:val="28"/>
+        </w:rPr>
+        <w:t>PR</w:t>
+      </w:r>
+      <w:r>
+        <w:rPr>
+          <w:rFonts w:ascii="Arial" w:hAnsi="Arial" w:cs="Arial"/>
+          <w:sz w:val="28"/>
+          <w:szCs w:val="28"/>
+        </w:rPr>
+        <w:t xml:space="preserve"> + </w:t>
+      </w:r>
+      <w:r>
+        <w:rPr>
+          <w:rFonts w:ascii="Arial" w:hAnsi="Arial" w:cs="Arial"/>
+          <w:sz w:val="28"/>
+          <w:szCs w:val="28"/>
+        </w:rPr>
+        <w:t>6</w:t>
+      </w:r>
+      <w:r>
+        <w:rPr>
+          <w:rFonts w:ascii="Arial" w:hAnsi="Arial" w:cs="Arial"/>
+          <w:sz w:val="28"/>
+          <w:szCs w:val="28"/>
+        </w:rPr>
+        <w:t>0 commitov</w:t>
+      </w:r>
+      <w:r>
+        <w:rPr>
+          <w:rFonts w:ascii="Arial" w:hAnsi="Arial" w:cs="Arial"/>
+          <w:sz w:val="28"/>
+          <w:szCs w:val="28"/>
+        </w:rPr>
+        <w:t>)</w:t>
+      </w:r>
+    </w:p>
+    <w:p>
+      <w:pPr>
+        <w:rPr>
+          <w:rFonts w:ascii="Arial" w:hAnsi="Arial" w:cs="Arial"/>
+          <w:sz w:val="28"/>
+          <w:szCs w:val="28"/>
+        </w:rPr>
+      </w:pPr>
+      <w:r>
+        <w:rPr>
+          <w:rFonts w:ascii="Arial" w:hAnsi="Arial" w:cs="Arial"/>
+          <w:sz w:val="28"/>
+          <w:szCs w:val="28"/>
+        </w:rPr>
+        <w:t>Interni roki:</w:t>
+      </w:r>
+    </w:p>
+    <w:p>
+      <w:pPr>
+        <w:pStyle w:val="Odstavekseznama"/>
+        <w:numPr>
+          <w:ilvl w:val="0"/>
+          <w:numId w:val="1"/>
+        </w:numPr>
+        <w:rPr>
+          <w:rFonts w:ascii="Arial" w:hAnsi="Arial" w:cs="Arial"/>
+          <w:sz w:val="28"/>
+          <w:szCs w:val="28"/>
+        </w:rPr>
+      </w:pPr>
+      <w:r>
+        <w:rPr>
+          <w:rFonts w:ascii="Arial" w:hAnsi="Arial" w:cs="Arial"/>
+          <w:sz w:val="28"/>
+          <w:szCs w:val="28"/>
+        </w:rPr>
+        <w:t>Do 3. 5. bo postavljeno okolje (dockerhub + github + simple backend + simple frontend</w:t>
+      </w:r>
+      <w:r>
+        <w:rPr>
+          <w:rFonts w:ascii="Arial" w:hAnsi="Arial" w:cs="Arial"/>
+          <w:sz w:val="28"/>
+          <w:szCs w:val="28"/>
+        </w:rPr>
+        <w:t xml:space="preserve"> + poročila za vsak predmet)</w:t>
+      </w:r>
+    </w:p>
+    <w:p>
+      <w:pPr>
+        <w:pStyle w:val="Odstavekseznama"/>
+        <w:numPr>
+          <w:ilvl w:val="0"/>
+          <w:numId w:val="1"/>
+        </w:numPr>
+        <w:rPr>
+          <w:rFonts w:ascii="Arial" w:hAnsi="Arial" w:cs="Arial"/>
+          <w:sz w:val="28"/>
+          <w:szCs w:val="28"/>
+        </w:rPr>
+      </w:pPr>
+      <w:r>
+        <w:rPr>
+          <w:rFonts w:ascii="Arial" w:hAnsi="Arial" w:cs="Arial"/>
+          <w:sz w:val="28"/>
+          <w:szCs w:val="28"/>
+        </w:rPr>
+        <w:t>Do 17. 5. bo</w:t>
+      </w:r>
+      <w:r>
+        <w:rPr>
+          <w:rFonts w:ascii="Arial" w:hAnsi="Arial" w:cs="Arial"/>
+          <w:sz w:val="28"/>
+          <w:szCs w:val="28"/>
+        </w:rPr>
+        <w:t>mo že zajemali podatke</w:t>
+      </w:r>
+      <w:r>
+        <w:rPr>
+          <w:rFonts w:ascii="Arial" w:hAnsi="Arial" w:cs="Arial"/>
+          <w:sz w:val="28"/>
+          <w:szCs w:val="28"/>
+        </w:rPr>
+        <w:t>, popolnoma pripravili podatkovno bazo</w:t>
+      </w:r>
+      <w:r>
+        <w:rPr>
+          <w:rFonts w:ascii="Arial" w:hAnsi="Arial" w:cs="Arial"/>
+          <w:sz w:val="28"/>
+          <w:szCs w:val="28"/>
+        </w:rPr>
+        <w:t xml:space="preserve"> in odpravili morebitne probleme, ki </w:t>
+      </w:r>
+      <w:r>
+        <w:rPr>
+          <w:rFonts w:ascii="Arial" w:hAnsi="Arial" w:cs="Arial"/>
+          <w:sz w:val="28"/>
+          <w:szCs w:val="28"/>
+        </w:rPr>
+        <w:t>bodo</w:t>
+      </w:r>
+      <w:r>
+        <w:rPr>
+          <w:rFonts w:ascii="Arial" w:hAnsi="Arial" w:cs="Arial"/>
+          <w:sz w:val="28"/>
+          <w:szCs w:val="28"/>
+        </w:rPr>
+        <w:t xml:space="preserve"> pri tem nastali</w:t>
+      </w:r>
+    </w:p>
+    <w:p>
+      <w:pPr>
+        <w:pStyle w:val="Odstavekseznama"/>
+        <w:numPr>
+          <w:ilvl w:val="0"/>
+          <w:numId w:val="1"/>
+        </w:numPr>
+        <w:rPr>
+          <w:rFonts w:ascii="Arial" w:hAnsi="Arial" w:cs="Arial"/>
+          <w:sz w:val="28"/>
+          <w:szCs w:val="28"/>
+        </w:rPr>
+      </w:pPr>
+      <w:r>
+        <w:rPr>
+          <w:rFonts w:ascii="Arial" w:hAnsi="Arial" w:cs="Arial"/>
+          <w:sz w:val="28"/>
+          <w:szCs w:val="28"/>
+        </w:rPr>
+        <w:t>Do 31. 5. bo aplikacija že prišla v testno fazo, kjer bomo tudi do</w:t>
+      </w:r>
+      <w:r>
+        <w:rPr>
+          <w:rFonts w:ascii="Arial" w:hAnsi="Arial" w:cs="Arial"/>
+          <w:sz w:val="28"/>
+          <w:szCs w:val="28"/>
+        </w:rPr>
+        <w:t>dali</w:t>
+      </w:r>
+      <w:r>
+        <w:rPr>
+          <w:rFonts w:ascii="Arial" w:hAnsi="Arial" w:cs="Arial"/>
+          <w:sz w:val="28"/>
+          <w:szCs w:val="28"/>
+        </w:rPr>
+        <w:t xml:space="preserve"> 2FA</w:t>
       </w:r>
     </w:p>
     <w:sectPr>
@@ -5099,6 +5023,7 @@
   <w:style w:type="character" w:default="1" w:styleId="Privzetapisavaodstavka">
     <w:name w:val="Default Paragraph Font"/>
     <w:uiPriority w:val="1"/>
+    <w:semiHidden/>
     <w:unhideWhenUsed/>
   </w:style>
   <w:style w:type="table" w:default="1" w:styleId="Navadnatabela">

</xml_diff>